<commit_message>
Expand website submission into full project report
</commit_message>
<xml_diff>
--- a/docs/Aurora_Vogue_Website_Submission.docx
+++ b/docs/Aurora_Vogue_Website_Submission.docx
@@ -4,7 +4,24 @@
   <w:body>
     <w:p>
       <w:pPr>
-        <w:spacing w:before="0" w:after="80"/>
+        <w:spacing w:before="2240" w:after="160"/>
+        <w:jc w:val="center"/>
+      </w:pPr>
+      <w:r>
+        <w:rPr>
+          <w:rFonts w:ascii="Georgia" w:hAnsi="Georgia"/>
+          <w:b/>
+          <w:i w:val="0"/>
+          <w:color w:val="111014"/>
+          <w:sz w:val="62"/>
+        </w:rPr>
+        <w:t>AURORA VOGUE</w:t>
+      </w:r>
+    </w:p>
+    <w:p>
+      <w:pPr>
+        <w:spacing w:before="0" w:after="1440"/>
+        <w:jc w:val="center"/>
       </w:pPr>
       <w:r>
         <w:rPr>
@@ -12,9 +29,165 @@
           <w:b/>
           <w:i w:val="0"/>
           <w:color w:val="C99A3D"/>
+          <w:sz w:val="26"/>
+        </w:rPr>
+        <w:t>FASHION HOUSE WEBSITE</w:t>
+      </w:r>
+    </w:p>
+    <w:p>
+      <w:pPr>
+        <w:keepLines/>
+        <w:spacing w:before="0" w:after="400"/>
+        <w:ind w:left="1440" w:right="1440"/>
+        <w:pBdr>
+          <w:bottom w:val="single" w:sz="5" w:space="5" w:color="DED7CE"/>
+        </w:pBdr>
+      </w:pPr>
+      <w:r>
+        <w:rPr>
+          <w:rFonts w:ascii="Aptos" w:hAnsi="Aptos"/>
+          <w:b/>
+          <w:i w:val="0"/>
+          <w:color w:val="716873"/>
+          <w:sz w:val="17"/>
+        </w:rPr>
+        <w:t>STUDENT NAME</w:t>
+        <w:br/>
+      </w:r>
+      <w:r>
+        <w:rPr>
+          <w:rFonts w:ascii="Aptos" w:hAnsi="Aptos"/>
+          <w:b w:val="0"/>
+          <w:i w:val="0"/>
+          <w:color w:val="211D22"/>
+          <w:sz w:val="23"/>
+        </w:rPr>
+        <w:t>XXXXXXXXXXXXXXXXXXXX</w:t>
+      </w:r>
+    </w:p>
+    <w:p>
+      <w:pPr>
+        <w:keepLines/>
+        <w:spacing w:before="0" w:after="400"/>
+        <w:ind w:left="1440" w:right="1440"/>
+        <w:pBdr>
+          <w:bottom w:val="single" w:sz="5" w:space="5" w:color="DED7CE"/>
+        </w:pBdr>
+      </w:pPr>
+      <w:r>
+        <w:rPr>
+          <w:rFonts w:ascii="Aptos" w:hAnsi="Aptos"/>
+          <w:b/>
+          <w:i w:val="0"/>
+          <w:color w:val="716873"/>
+          <w:sz w:val="17"/>
+        </w:rPr>
+        <w:t>STUDENT EMAIL</w:t>
+        <w:br/>
+      </w:r>
+      <w:r>
+        <w:rPr>
+          <w:rFonts w:ascii="Aptos" w:hAnsi="Aptos"/>
+          <w:b w:val="0"/>
+          <w:i w:val="0"/>
+          <w:color w:val="211D22"/>
+          <w:sz w:val="23"/>
+        </w:rPr>
+        <w:t>XXXXXXXXXXXXXXXXXXXX</w:t>
+      </w:r>
+    </w:p>
+    <w:p>
+      <w:pPr>
+        <w:keepLines/>
+        <w:spacing w:before="0" w:after="400"/>
+        <w:ind w:left="1440" w:right="1440"/>
+        <w:pBdr>
+          <w:bottom w:val="single" w:sz="5" w:space="5" w:color="DED7CE"/>
+        </w:pBdr>
+      </w:pPr>
+      <w:r>
+        <w:rPr>
+          <w:rFonts w:ascii="Aptos" w:hAnsi="Aptos"/>
+          <w:b/>
+          <w:i w:val="0"/>
+          <w:color w:val="716873"/>
+          <w:sz w:val="17"/>
+        </w:rPr>
+        <w:t>DEPARTMENT</w:t>
+        <w:br/>
+      </w:r>
+      <w:r>
+        <w:rPr>
+          <w:rFonts w:ascii="Aptos" w:hAnsi="Aptos"/>
+          <w:b w:val="0"/>
+          <w:i w:val="0"/>
+          <w:color w:val="211D22"/>
+          <w:sz w:val="23"/>
+        </w:rPr>
+        <w:t>XXXXXXXXXXXXXXXXXXXX</w:t>
+      </w:r>
+    </w:p>
+    <w:p>
+      <w:pPr>
+        <w:keepLines/>
+        <w:spacing w:before="0" w:after="400"/>
+        <w:ind w:left="1440" w:right="1440"/>
+        <w:pBdr>
+          <w:bottom w:val="single" w:sz="5" w:space="5" w:color="DED7CE"/>
+        </w:pBdr>
+      </w:pPr>
+      <w:r>
+        <w:rPr>
+          <w:rFonts w:ascii="Aptos" w:hAnsi="Aptos"/>
+          <w:b/>
+          <w:i w:val="0"/>
+          <w:color w:val="716873"/>
+          <w:sz w:val="17"/>
+        </w:rPr>
+        <w:t>MATRIC NUMBER</w:t>
+        <w:br/>
+      </w:r>
+      <w:r>
+        <w:rPr>
+          <w:rFonts w:ascii="Aptos" w:hAnsi="Aptos"/>
+          <w:b w:val="0"/>
+          <w:i w:val="0"/>
+          <w:color w:val="211D22"/>
+          <w:sz w:val="23"/>
+        </w:rPr>
+        <w:t>XXXXXXXXXXXXXXXXXXXX</w:t>
+      </w:r>
+    </w:p>
+    <w:p>
+      <w:r>
+        <w:br w:type="page"/>
+      </w:r>
+    </w:p>
+    <w:p>
+      <w:pPr>
+        <w:pStyle w:val="Heading1"/>
+        <w:spacing w:before="0"/>
+      </w:pPr>
+      <w:r>
+        <w:t>Table of Contents</w:t>
+      </w:r>
+    </w:p>
+    <w:p>
+      <w:pPr>
+        <w:tabs>
+          <w:tab w:pos="9144" w:val="right" w:leader="dot"/>
+        </w:tabs>
+        <w:spacing w:before="0" w:after="80"/>
+      </w:pPr>
+      <w:r>
+        <w:rPr>
+          <w:rFonts w:ascii="Aptos" w:hAnsi="Aptos"/>
+          <w:b w:val="0"/>
+          <w:i w:val="0"/>
+          <w:color w:val="211D22"/>
           <w:sz w:val="20"/>
         </w:rPr>
-        <w:t>CSC 106 / IFT 203</w:t>
+        <w:t>Project Overview</w:t>
       </w:r>
       <w:r>
         <w:rPr>
@@ -22,464 +195,250 @@
           <w:b/>
           <w:i w:val="0"/>
           <w:color w:val="716873"/>
-          <w:sz w:val="18"/>
+          <w:sz w:val="20"/>
         </w:rPr>
-        <w:t xml:space="preserve">   •   WEB TECHNOLOGY PROJECT</w:t>
+        <w:tab/>
+        <w:t>2</w:t>
       </w:r>
     </w:p>
     <w:p>
       <w:pPr>
-        <w:spacing w:before="0" w:after="20"/>
+        <w:tabs>
+          <w:tab w:pos="9144" w:val="right" w:leader="dot"/>
+        </w:tabs>
+        <w:spacing w:before="0" w:after="80"/>
       </w:pPr>
       <w:r>
         <w:rPr>
-          <w:rFonts w:ascii="Georgia" w:hAnsi="Georgia"/>
-          <w:b/>
+          <w:rFonts w:ascii="Aptos" w:hAnsi="Aptos"/>
+          <w:b w:val="0"/>
           <w:i w:val="0"/>
-          <w:color w:val="111014"/>
-          <w:sz w:val="56"/>
+          <w:color w:val="211D22"/>
+          <w:sz w:val="20"/>
         </w:rPr>
-        <w:t>WEBSITE SUBMISSION</w:t>
+        <w:t>Website Features</w:t>
       </w:r>
-    </w:p>
-    <w:p>
-      <w:pPr>
-        <w:spacing w:before="0" w:after="200"/>
-      </w:pPr>
       <w:r>
         <w:rPr>
           <w:rFonts w:ascii="Aptos" w:hAnsi="Aptos"/>
           <w:b/>
           <w:i w:val="0"/>
-          <w:color w:val="C99A3D"/>
-          <w:sz w:val="28"/>
+          <w:color w:val="716873"/>
+          <w:sz w:val="20"/>
         </w:rPr>
-        <w:t>Aurora Vogue Fashion House</w:t>
+        <w:tab/>
+        <w:t>3</w:t>
       </w:r>
     </w:p>
     <w:p>
       <w:pPr>
-        <w:keepNext/>
-        <w:spacing w:after="80"/>
-        <w:jc w:val="center"/>
-      </w:pPr>
-      <w:r>
-        <w:drawing>
-          <wp:inline xmlns:a="http://schemas.openxmlformats.org/drawingml/2006/main" xmlns:pic="http://schemas.openxmlformats.org/drawingml/2006/picture">
-            <wp:extent cx="5943600" cy="3614233"/>
-            <wp:docPr id="1" name="Picture 1" descr="Aurora Vogue Fashion House homepage displayed in a desktop browser" title="Aurora Vogue Fashion House homepage displayed in a desktop browser"/>
-            <wp:cNvGraphicFramePr>
-              <a:graphicFrameLocks noChangeAspect="1"/>
-            </wp:cNvGraphicFramePr>
-            <a:graphic>
-              <a:graphicData uri="http://schemas.openxmlformats.org/drawingml/2006/picture">
-                <pic:pic>
-                  <pic:nvPicPr>
-                    <pic:cNvPr id="0" name="Screenshot From 2026-07-16 14-43-33.jpg"/>
-                    <pic:cNvPicPr/>
-                  </pic:nvPicPr>
-                  <pic:blipFill>
-                    <a:blip r:embed="rId11"/>
-                    <a:stretch>
-                      <a:fillRect/>
-                    </a:stretch>
-                  </pic:blipFill>
-                  <pic:spPr>
-                    <a:xfrm>
-                      <a:off x="0" y="0"/>
-                      <a:ext cx="5943600" cy="3614233"/>
-                    </a:xfrm>
-                    <a:prstGeom prst="rect"/>
-                  </pic:spPr>
-                </pic:pic>
-              </a:graphicData>
-            </a:graphic>
-          </wp:inline>
-        </w:drawing>
-      </w:r>
-    </w:p>
-    <w:p>
-      <w:pPr>
-        <w:spacing w:after="200"/>
-        <w:jc w:val="right"/>
+        <w:tabs>
+          <w:tab w:pos="9144" w:val="right" w:leader="dot"/>
+        </w:tabs>
+        <w:spacing w:before="0" w:after="80"/>
       </w:pPr>
       <w:r>
         <w:rPr>
           <w:rFonts w:ascii="Aptos" w:hAnsi="Aptos"/>
           <w:b w:val="0"/>
-          <w:i/>
-          <w:color w:val="716873"/>
-          <w:sz w:val="17"/>
+          <w:i w:val="0"/>
+          <w:color w:val="211D22"/>
+          <w:sz w:val="20"/>
         </w:rPr>
-        <w:t>Homepage preview • Aurora Vogue</w:t>
+        <w:t>JavaScript Features</w:t>
       </w:r>
-    </w:p>
-    <w:tbl>
-      <w:tblPr>
-        <w:tblW w:type="dxa" w:w="9360"/>
-        <w:jc w:val="left"/>
-        <w:tblLayout w:type="fixed"/>
-        <w:tblLook w:firstColumn="1" w:firstRow="1" w:lastColumn="0" w:lastRow="0" w:noHBand="0" w:noVBand="1" w:val="04A0"/>
-        <w:tblInd w:w="120" w:type="dxa"/>
-        <w:tblBorders>
-          <w:top w:val="single" w:sz="6" w:color="DED7CE"/>
-          <w:left w:val="single" w:sz="6" w:color="DED7CE"/>
-          <w:bottom w:val="single" w:sz="6" w:color="DED7CE"/>
-          <w:right w:val="single" w:sz="6" w:color="DED7CE"/>
-          <w:insideH w:val="single" w:sz="6" w:color="DED7CE"/>
-          <w:insideV w:val="single" w:sz="6" w:color="DED7CE"/>
-        </w:tblBorders>
-      </w:tblPr>
-      <w:tblGrid>
-        <w:gridCol w:w="2880"/>
-        <w:gridCol w:w="6480"/>
-      </w:tblGrid>
-      <w:tr>
-        <w:tc>
-          <w:tcPr>
-            <w:tcW w:type="dxa" w:w="2880"/>
-            <w:tcMar>
-              <w:top w:w="105" w:type="dxa"/>
-              <w:start w:w="150" w:type="dxa"/>
-              <w:bottom w:w="105" w:type="dxa"/>
-              <w:end w:w="120" w:type="dxa"/>
-            </w:tcMar>
-            <w:shd w:fill="111014"/>
-            <w:vAlign w:val="center"/>
-          </w:tcPr>
-          <w:p>
-            <w:pPr>
-              <w:spacing w:before="0" w:after="0" w:line="252" w:lineRule="auto"/>
-              <w:jc w:val="left"/>
-            </w:pPr>
-            <w:r/>
-            <w:r>
-              <w:rPr>
-                <w:rFonts w:ascii="Aptos" w:hAnsi="Aptos"/>
-                <w:b/>
-                <w:i w:val="0"/>
-                <w:color w:val="F6E8C8"/>
-                <w:sz w:val="17"/>
-              </w:rPr>
-              <w:t>NAME</w:t>
-            </w:r>
-          </w:p>
-        </w:tc>
-        <w:tc>
-          <w:tcPr>
-            <w:tcW w:type="dxa" w:w="6480"/>
-            <w:tcMar>
-              <w:top w:w="105" w:type="dxa"/>
-              <w:start w:w="150" w:type="dxa"/>
-              <w:bottom w:w="105" w:type="dxa"/>
-              <w:end w:w="120" w:type="dxa"/>
-            </w:tcMar>
-            <w:shd w:fill="F7F4EF"/>
-            <w:vAlign w:val="center"/>
-          </w:tcPr>
-          <w:p>
-            <w:pPr>
-              <w:spacing w:before="0" w:after="0" w:line="252" w:lineRule="auto"/>
-              <w:jc w:val="left"/>
-            </w:pPr>
-            <w:r/>
-            <w:r>
-              <w:rPr>
-                <w:rFonts w:ascii="Aptos" w:hAnsi="Aptos"/>
-                <w:b w:val="0"/>
-                <w:i w:val="0"/>
-                <w:color w:val="211D22"/>
-                <w:sz w:val="21"/>
-              </w:rPr>
-              <w:t>XXXXXXXXXXXXXXXXXXXX</w:t>
-            </w:r>
-          </w:p>
-        </w:tc>
-      </w:tr>
-      <w:tr>
-        <w:tc>
-          <w:tcPr>
-            <w:tcW w:type="dxa" w:w="2880"/>
-            <w:tcMar>
-              <w:top w:w="105" w:type="dxa"/>
-              <w:start w:w="150" w:type="dxa"/>
-              <w:bottom w:w="105" w:type="dxa"/>
-              <w:end w:w="120" w:type="dxa"/>
-            </w:tcMar>
-            <w:shd w:fill="111014"/>
-            <w:vAlign w:val="center"/>
-          </w:tcPr>
-          <w:p>
-            <w:pPr>
-              <w:spacing w:before="0" w:after="0" w:line="252" w:lineRule="auto"/>
-              <w:jc w:val="left"/>
-            </w:pPr>
-            <w:r/>
-            <w:r>
-              <w:rPr>
-                <w:rFonts w:ascii="Aptos" w:hAnsi="Aptos"/>
-                <w:b/>
-                <w:i w:val="0"/>
-                <w:color w:val="F6E8C8"/>
-                <w:sz w:val="17"/>
-              </w:rPr>
-              <w:t>EMAIL</w:t>
-            </w:r>
-          </w:p>
-        </w:tc>
-        <w:tc>
-          <w:tcPr>
-            <w:tcW w:type="dxa" w:w="6480"/>
-            <w:tcMar>
-              <w:top w:w="105" w:type="dxa"/>
-              <w:start w:w="150" w:type="dxa"/>
-              <w:bottom w:w="105" w:type="dxa"/>
-              <w:end w:w="120" w:type="dxa"/>
-            </w:tcMar>
-            <w:shd w:fill="F7F4EF"/>
-            <w:vAlign w:val="center"/>
-          </w:tcPr>
-          <w:p>
-            <w:pPr>
-              <w:spacing w:before="0" w:after="0" w:line="252" w:lineRule="auto"/>
-              <w:jc w:val="left"/>
-            </w:pPr>
-            <w:r/>
-            <w:r>
-              <w:rPr>
-                <w:rFonts w:ascii="Aptos" w:hAnsi="Aptos"/>
-                <w:b w:val="0"/>
-                <w:i w:val="0"/>
-                <w:color w:val="211D22"/>
-                <w:sz w:val="21"/>
-              </w:rPr>
-              <w:t>XXXXXXXXXXXXXXXXXXXX</w:t>
-            </w:r>
-          </w:p>
-        </w:tc>
-      </w:tr>
-      <w:tr>
-        <w:tc>
-          <w:tcPr>
-            <w:tcW w:type="dxa" w:w="2880"/>
-            <w:tcMar>
-              <w:top w:w="105" w:type="dxa"/>
-              <w:start w:w="150" w:type="dxa"/>
-              <w:bottom w:w="105" w:type="dxa"/>
-              <w:end w:w="120" w:type="dxa"/>
-            </w:tcMar>
-            <w:shd w:fill="111014"/>
-            <w:vAlign w:val="center"/>
-          </w:tcPr>
-          <w:p>
-            <w:pPr>
-              <w:spacing w:before="0" w:after="0" w:line="252" w:lineRule="auto"/>
-              <w:jc w:val="left"/>
-            </w:pPr>
-            <w:r/>
-            <w:r>
-              <w:rPr>
-                <w:rFonts w:ascii="Aptos" w:hAnsi="Aptos"/>
-                <w:b/>
-                <w:i w:val="0"/>
-                <w:color w:val="F6E8C8"/>
-                <w:sz w:val="17"/>
-              </w:rPr>
-              <w:t>DEPARTMENT</w:t>
-            </w:r>
-          </w:p>
-        </w:tc>
-        <w:tc>
-          <w:tcPr>
-            <w:tcW w:type="dxa" w:w="6480"/>
-            <w:tcMar>
-              <w:top w:w="105" w:type="dxa"/>
-              <w:start w:w="150" w:type="dxa"/>
-              <w:bottom w:w="105" w:type="dxa"/>
-              <w:end w:w="120" w:type="dxa"/>
-            </w:tcMar>
-            <w:shd w:fill="F7F4EF"/>
-            <w:vAlign w:val="center"/>
-          </w:tcPr>
-          <w:p>
-            <w:pPr>
-              <w:spacing w:before="0" w:after="0" w:line="252" w:lineRule="auto"/>
-              <w:jc w:val="left"/>
-            </w:pPr>
-            <w:r/>
-            <w:r>
-              <w:rPr>
-                <w:rFonts w:ascii="Aptos" w:hAnsi="Aptos"/>
-                <w:b w:val="0"/>
-                <w:i w:val="0"/>
-                <w:color w:val="211D22"/>
-                <w:sz w:val="21"/>
-              </w:rPr>
-              <w:t>XXXXXXXXXXXXXXXXXXXX</w:t>
-            </w:r>
-          </w:p>
-        </w:tc>
-      </w:tr>
-      <w:tr>
-        <w:tc>
-          <w:tcPr>
-            <w:tcW w:type="dxa" w:w="2880"/>
-            <w:tcMar>
-              <w:top w:w="105" w:type="dxa"/>
-              <w:start w:w="150" w:type="dxa"/>
-              <w:bottom w:w="105" w:type="dxa"/>
-              <w:end w:w="120" w:type="dxa"/>
-            </w:tcMar>
-            <w:shd w:fill="111014"/>
-            <w:vAlign w:val="center"/>
-          </w:tcPr>
-          <w:p>
-            <w:pPr>
-              <w:spacing w:before="0" w:after="0" w:line="252" w:lineRule="auto"/>
-              <w:jc w:val="left"/>
-            </w:pPr>
-            <w:r/>
-            <w:r>
-              <w:rPr>
-                <w:rFonts w:ascii="Aptos" w:hAnsi="Aptos"/>
-                <w:b/>
-                <w:i w:val="0"/>
-                <w:color w:val="F6E8C8"/>
-                <w:sz w:val="17"/>
-              </w:rPr>
-              <w:t>MATRICULATION NUMBER</w:t>
-            </w:r>
-          </w:p>
-        </w:tc>
-        <w:tc>
-          <w:tcPr>
-            <w:tcW w:type="dxa" w:w="6480"/>
-            <w:tcMar>
-              <w:top w:w="105" w:type="dxa"/>
-              <w:start w:w="150" w:type="dxa"/>
-              <w:bottom w:w="105" w:type="dxa"/>
-              <w:end w:w="120" w:type="dxa"/>
-            </w:tcMar>
-            <w:shd w:fill="F7F4EF"/>
-            <w:vAlign w:val="center"/>
-          </w:tcPr>
-          <w:p>
-            <w:pPr>
-              <w:spacing w:before="0" w:after="0" w:line="252" w:lineRule="auto"/>
-              <w:jc w:val="left"/>
-            </w:pPr>
-            <w:r/>
-            <w:r>
-              <w:rPr>
-                <w:rFonts w:ascii="Aptos" w:hAnsi="Aptos"/>
-                <w:b w:val="0"/>
-                <w:i w:val="0"/>
-                <w:color w:val="211D22"/>
-                <w:sz w:val="21"/>
-              </w:rPr>
-              <w:t>XXXXXXXXXXXXXXXXXXXX</w:t>
-            </w:r>
-          </w:p>
-        </w:tc>
-      </w:tr>
-      <w:tr>
-        <w:tc>
-          <w:tcPr>
-            <w:tcW w:type="dxa" w:w="2880"/>
-            <w:tcMar>
-              <w:top w:w="105" w:type="dxa"/>
-              <w:start w:w="150" w:type="dxa"/>
-              <w:bottom w:w="105" w:type="dxa"/>
-              <w:end w:w="120" w:type="dxa"/>
-            </w:tcMar>
-            <w:shd w:fill="111014"/>
-            <w:vAlign w:val="center"/>
-          </w:tcPr>
-          <w:p>
-            <w:pPr>
-              <w:spacing w:before="0" w:after="0" w:line="252" w:lineRule="auto"/>
-              <w:jc w:val="left"/>
-            </w:pPr>
-            <w:r/>
-            <w:r>
-              <w:rPr>
-                <w:rFonts w:ascii="Aptos" w:hAnsi="Aptos"/>
-                <w:b/>
-                <w:i w:val="0"/>
-                <w:color w:val="F6E8C8"/>
-                <w:sz w:val="17"/>
-              </w:rPr>
-              <w:t>WEBSITE FILES LINK</w:t>
-            </w:r>
-          </w:p>
-        </w:tc>
-        <w:tc>
-          <w:tcPr>
-            <w:tcW w:type="dxa" w:w="6480"/>
-            <w:tcMar>
-              <w:top w:w="105" w:type="dxa"/>
-              <w:start w:w="150" w:type="dxa"/>
-              <w:bottom w:w="105" w:type="dxa"/>
-              <w:end w:w="120" w:type="dxa"/>
-            </w:tcMar>
-            <w:shd w:fill="F7F4EF"/>
-            <w:vAlign w:val="center"/>
-          </w:tcPr>
-          <w:p>
-            <w:pPr>
-              <w:spacing w:before="0" w:after="0" w:line="252" w:lineRule="auto"/>
-              <w:jc w:val="left"/>
-            </w:pPr>
-            <w:r/>
-            <w:r>
-              <w:rPr>
-                <w:rFonts w:ascii="Aptos" w:hAnsi="Aptos"/>
-                <w:b w:val="0"/>
-                <w:i w:val="0"/>
-                <w:color w:val="211D22"/>
-                <w:sz w:val="21"/>
-              </w:rPr>
-              <w:t>XXXXXXXXXXXXXXXXXXXX</w:t>
-            </w:r>
-          </w:p>
-        </w:tc>
-      </w:tr>
-    </w:tbl>
-    <w:p>
-      <w:r>
-        <w:br w:type="page"/>
-      </w:r>
-    </w:p>
-    <w:p>
-      <w:pPr>
-        <w:spacing w:before="0" w:after="40"/>
-      </w:pPr>
       <w:r>
         <w:rPr>
           <w:rFonts w:ascii="Aptos" w:hAnsi="Aptos"/>
           <w:b/>
           <w:i w:val="0"/>
-          <w:color w:val="C99A3D"/>
-          <w:sz w:val="18"/>
+          <w:color w:val="716873"/>
+          <w:sz w:val="20"/>
         </w:rPr>
-        <w:t>AURORA VOGUE</w:t>
+        <w:tab/>
+        <w:t>3</w:t>
+      </w:r>
+    </w:p>
+    <w:p>
+      <w:pPr>
+        <w:tabs>
+          <w:tab w:pos="9144" w:val="right" w:leader="dot"/>
+        </w:tabs>
+        <w:spacing w:before="0" w:after="80"/>
+      </w:pPr>
+      <w:r>
+        <w:rPr>
+          <w:rFonts w:ascii="Aptos" w:hAnsi="Aptos"/>
+          <w:b w:val="0"/>
+          <w:i w:val="0"/>
+          <w:color w:val="211D22"/>
+          <w:sz w:val="20"/>
+        </w:rPr>
+        <w:t>DOM Structure</w:t>
+      </w:r>
+      <w:r>
+        <w:rPr>
+          <w:rFonts w:ascii="Aptos" w:hAnsi="Aptos"/>
+          <w:b/>
+          <w:i w:val="0"/>
+          <w:color w:val="716873"/>
+          <w:sz w:val="20"/>
+        </w:rPr>
+        <w:tab/>
+        <w:t>3</w:t>
+      </w:r>
+    </w:p>
+    <w:p>
+      <w:pPr>
+        <w:tabs>
+          <w:tab w:pos="9144" w:val="right" w:leader="dot"/>
+        </w:tabs>
+        <w:spacing w:before="0" w:after="80"/>
+      </w:pPr>
+      <w:r>
+        <w:rPr>
+          <w:rFonts w:ascii="Aptos" w:hAnsi="Aptos"/>
+          <w:b w:val="0"/>
+          <w:i w:val="0"/>
+          <w:color w:val="211D22"/>
+          <w:sz w:val="20"/>
+        </w:rPr>
+        <w:t>Website Screenshots</w:t>
+      </w:r>
+      <w:r>
+        <w:rPr>
+          <w:rFonts w:ascii="Aptos" w:hAnsi="Aptos"/>
+          <w:b/>
+          <w:i w:val="0"/>
+          <w:color w:val="716873"/>
+          <w:sz w:val="20"/>
+        </w:rPr>
+        <w:tab/>
+        <w:t>4–6</w:t>
+      </w:r>
+    </w:p>
+    <w:p>
+      <w:pPr>
+        <w:tabs>
+          <w:tab w:pos="9144" w:val="right" w:leader="dot"/>
+        </w:tabs>
+        <w:spacing w:before="0" w:after="80"/>
+      </w:pPr>
+      <w:r>
+        <w:rPr>
+          <w:rFonts w:ascii="Aptos" w:hAnsi="Aptos"/>
+          <w:b w:val="0"/>
+          <w:i w:val="0"/>
+          <w:color w:val="211D22"/>
+          <w:sz w:val="20"/>
+        </w:rPr>
+        <w:t>Source Code &amp; Supporting Files</w:t>
+      </w:r>
+      <w:r>
+        <w:rPr>
+          <w:rFonts w:ascii="Aptos" w:hAnsi="Aptos"/>
+          <w:b/>
+          <w:i w:val="0"/>
+          <w:color w:val="716873"/>
+          <w:sz w:val="20"/>
+        </w:rPr>
+        <w:tab/>
+        <w:t>6</w:t>
+      </w:r>
+    </w:p>
+    <w:p>
+      <w:pPr>
+        <w:tabs>
+          <w:tab w:pos="9144" w:val="right" w:leader="dot"/>
+        </w:tabs>
+        <w:spacing w:before="0" w:after="80"/>
+      </w:pPr>
+      <w:r>
+        <w:rPr>
+          <w:rFonts w:ascii="Aptos" w:hAnsi="Aptos"/>
+          <w:b w:val="0"/>
+          <w:i w:val="0"/>
+          <w:color w:val="211D22"/>
+          <w:sz w:val="20"/>
+        </w:rPr>
+        <w:t>Live Website</w:t>
+      </w:r>
+      <w:r>
+        <w:rPr>
+          <w:rFonts w:ascii="Aptos" w:hAnsi="Aptos"/>
+          <w:b/>
+          <w:i w:val="0"/>
+          <w:color w:val="716873"/>
+          <w:sz w:val="20"/>
+        </w:rPr>
+        <w:tab/>
+        <w:t>6</w:t>
+      </w:r>
+    </w:p>
+    <w:p>
+      <w:pPr>
+        <w:tabs>
+          <w:tab w:pos="9144" w:val="right" w:leader="dot"/>
+        </w:tabs>
+        <w:spacing w:before="0" w:after="80"/>
+      </w:pPr>
+      <w:r>
+        <w:rPr>
+          <w:rFonts w:ascii="Aptos" w:hAnsi="Aptos"/>
+          <w:b w:val="0"/>
+          <w:i w:val="0"/>
+          <w:color w:val="211D22"/>
+          <w:sz w:val="20"/>
+        </w:rPr>
+        <w:t>GitHub Repository</w:t>
+      </w:r>
+      <w:r>
+        <w:rPr>
+          <w:rFonts w:ascii="Aptos" w:hAnsi="Aptos"/>
+          <w:b/>
+          <w:i w:val="0"/>
+          <w:color w:val="716873"/>
+          <w:sz w:val="20"/>
+        </w:rPr>
+        <w:tab/>
+        <w:t>6</w:t>
+      </w:r>
+    </w:p>
+    <w:p>
+      <w:pPr>
+        <w:tabs>
+          <w:tab w:pos="9144" w:val="right" w:leader="dot"/>
+        </w:tabs>
+        <w:spacing w:before="0" w:after="80"/>
+      </w:pPr>
+      <w:r>
+        <w:rPr>
+          <w:rFonts w:ascii="Aptos" w:hAnsi="Aptos"/>
+          <w:b w:val="0"/>
+          <w:i w:val="0"/>
+          <w:color w:val="211D22"/>
+          <w:sz w:val="20"/>
+        </w:rPr>
+        <w:t>Conclusion</w:t>
+      </w:r>
+      <w:r>
+        <w:rPr>
+          <w:rFonts w:ascii="Aptos" w:hAnsi="Aptos"/>
+          <w:b/>
+          <w:i w:val="0"/>
+          <w:color w:val="716873"/>
+          <w:sz w:val="20"/>
+        </w:rPr>
+        <w:tab/>
+        <w:t>6</w:t>
       </w:r>
     </w:p>
     <w:p>
       <w:pPr>
         <w:pStyle w:val="Heading1"/>
-        <w:spacing w:before="0" w:after="140"/>
       </w:pPr>
       <w:r>
-        <w:t>Website Information</w:t>
-      </w:r>
-    </w:p>
-    <w:p>
-      <w:pPr>
-        <w:pStyle w:val="Heading2"/>
-      </w:pPr>
-      <w:r>
-        <w:t>Website Description</w:t>
+        <w:t>Project Overview</w:t>
       </w:r>
     </w:p>
     <w:p>
@@ -494,7 +453,7 @@
           <w:color w:val="211D22"/>
           <w:sz w:val="21"/>
         </w:rPr>
-        <w:t>Aurora Vogue is a responsive multi-page fashion house website developed as a CSC 106/IFT 203 web technology project. It presents an upcoming fashion brand offering modern couture, formal wear, bridal styling, ready-to-wear pieces, accessories, and footwear. The website serves as a polished digital catalogue and information hub for prospective clients while demonstrating core front-end web development concepts.</w:t>
+        <w:t>Aurora Vogue is a responsive, multi-page website for an upcoming fashion house. It presents the brand, showcases clothing and accessories, introduces the leadership team, promotes upcoming events, and provides a structured appointment and inquiry experience.</w:t>
       </w:r>
     </w:p>
     <w:tbl>
@@ -523,9 +482,9 @@
           <w:tcPr>
             <w:tcW w:type="dxa" w:w="3120"/>
             <w:tcMar>
-              <w:top w:w="120" w:type="dxa"/>
+              <w:top w:w="130" w:type="dxa"/>
               <w:start w:w="140" w:type="dxa"/>
-              <w:bottom w:w="120" w:type="dxa"/>
+              <w:bottom w:w="130" w:type="dxa"/>
               <w:end w:w="140" w:type="dxa"/>
             </w:tcMar>
             <w:shd w:fill="F7F4EF"/>
@@ -557,9 +516,9 @@
                 <w:b w:val="0"/>
                 <w:i w:val="0"/>
                 <w:color w:val="211D22"/>
-                <w:sz w:val="17"/>
+                <w:sz w:val="18"/>
               </w:rPr>
-              <w:t>Showcase collections, introduce the board, support inquiries and promote fashion events.</w:t>
+              <w:t>Provide a polished digital catalogue and information hub for Aurora Vogue’s products, services and events.</w:t>
             </w:r>
           </w:p>
         </w:tc>
@@ -567,9 +526,9 @@
           <w:tcPr>
             <w:tcW w:type="dxa" w:w="3120"/>
             <w:tcMar>
-              <w:top w:w="120" w:type="dxa"/>
+              <w:top w:w="130" w:type="dxa"/>
               <w:start w:w="140" w:type="dxa"/>
-              <w:bottom w:w="120" w:type="dxa"/>
+              <w:bottom w:w="130" w:type="dxa"/>
               <w:end w:w="140" w:type="dxa"/>
             </w:tcMar>
             <w:shd w:fill="F7F4EF"/>
@@ -588,7 +547,7 @@
                 <w:color w:val="C99A3D"/>
                 <w:sz w:val="16"/>
               </w:rPr>
-              <w:t>KEY FEATURES</w:t>
+              <w:t>TARGET AUDIENCE</w:t>
             </w:r>
           </w:p>
           <w:p>
@@ -601,9 +560,9 @@
                 <w:b w:val="0"/>
                 <w:i w:val="0"/>
                 <w:color w:val="211D22"/>
-                <w:sz w:val="17"/>
+                <w:sz w:val="18"/>
               </w:rPr>
-              <w:t>Six linked pages, responsive navigation, product filters, profile modals, booking interactions and an event countdown.</w:t>
+              <w:t>Prospective fashion clients, including students, professionals, wedding parties and event guests.</w:t>
             </w:r>
           </w:p>
         </w:tc>
@@ -611,9 +570,9 @@
           <w:tcPr>
             <w:tcW w:type="dxa" w:w="3120"/>
             <w:tcMar>
-              <w:top w:w="120" w:type="dxa"/>
+              <w:top w:w="130" w:type="dxa"/>
               <w:start w:w="140" w:type="dxa"/>
-              <w:bottom w:w="120" w:type="dxa"/>
+              <w:bottom w:w="130" w:type="dxa"/>
               <w:end w:w="140" w:type="dxa"/>
             </w:tcMar>
             <w:shd w:fill="F7F4EF"/>
@@ -632,7 +591,7 @@
                 <w:color w:val="C99A3D"/>
                 <w:sz w:val="16"/>
               </w:rPr>
-              <w:t>INTENDED USERS</w:t>
+              <w:t>TECHNOLOGIES</w:t>
             </w:r>
           </w:p>
           <w:p>
@@ -645,9 +604,394 @@
                 <w:b w:val="0"/>
                 <w:i w:val="0"/>
                 <w:color w:val="211D22"/>
+                <w:sz w:val="18"/>
+              </w:rPr>
+              <w:t>Semantic HTML5, external CSS3, vanilla JavaScript, local image assets and GitHub Pages deployment.</w:t>
+            </w:r>
+          </w:p>
+        </w:tc>
+      </w:tr>
+    </w:tbl>
+    <w:p>
+      <w:r>
+        <w:br w:type="page"/>
+      </w:r>
+    </w:p>
+    <w:p>
+      <w:pPr>
+        <w:pStyle w:val="Heading1"/>
+        <w:spacing w:before="0"/>
+      </w:pPr>
+      <w:r>
+        <w:t>Website Features</w:t>
+      </w:r>
+    </w:p>
+    <w:tbl>
+      <w:tblPr>
+        <w:tblW w:type="dxa" w:w="9360"/>
+        <w:jc w:val="left"/>
+        <w:tblLayout w:type="fixed"/>
+        <w:tblLook w:firstColumn="1" w:firstRow="1" w:lastColumn="0" w:lastRow="0" w:noHBand="0" w:noVBand="1" w:val="04A0"/>
+        <w:tblInd w:w="120" w:type="dxa"/>
+        <w:tblBorders>
+          <w:top w:val="single" w:sz="5" w:color="DED7CE"/>
+          <w:left w:val="single" w:sz="5" w:color="DED7CE"/>
+          <w:bottom w:val="single" w:sz="5" w:color="DED7CE"/>
+          <w:right w:val="single" w:sz="5" w:color="DED7CE"/>
+          <w:insideH w:val="single" w:sz="5" w:color="DED7CE"/>
+          <w:insideV w:val="single" w:sz="5" w:color="DED7CE"/>
+        </w:tblBorders>
+      </w:tblPr>
+      <w:tblGrid>
+        <w:gridCol w:w="1960"/>
+        <w:gridCol w:w="7400"/>
+      </w:tblGrid>
+      <w:tr>
+        <w:trPr>
+          <w:tblHeader w:val="true"/>
+        </w:trPr>
+        <w:tc>
+          <w:tcPr>
+            <w:tcW w:type="dxa" w:w="1960"/>
+            <w:tcMar>
+              <w:top w:w="90" w:type="dxa"/>
+              <w:start w:w="130" w:type="dxa"/>
+              <w:bottom w:w="90" w:type="dxa"/>
+              <w:end w:w="130" w:type="dxa"/>
+            </w:tcMar>
+            <w:shd w:fill="111014"/>
+          </w:tcPr>
+          <w:p>
+            <w:r/>
+            <w:r>
+              <w:rPr>
+                <w:rFonts w:ascii="Aptos" w:hAnsi="Aptos"/>
+                <w:b/>
+                <w:i w:val="0"/>
+                <w:color w:val="F6E8C8"/>
+                <w:sz w:val="16"/>
+              </w:rPr>
+              <w:t>PAGE</w:t>
+            </w:r>
+          </w:p>
+        </w:tc>
+        <w:tc>
+          <w:tcPr>
+            <w:tcW w:type="dxa" w:w="7400"/>
+            <w:tcMar>
+              <w:top w:w="90" w:type="dxa"/>
+              <w:start w:w="130" w:type="dxa"/>
+              <w:bottom w:w="90" w:type="dxa"/>
+              <w:end w:w="130" w:type="dxa"/>
+            </w:tcMar>
+            <w:shd w:fill="111014"/>
+          </w:tcPr>
+          <w:p>
+            <w:r/>
+            <w:r>
+              <w:rPr>
+                <w:rFonts w:ascii="Aptos" w:hAnsi="Aptos"/>
+                <w:b/>
+                <w:i w:val="0"/>
+                <w:color w:val="F6E8C8"/>
+                <w:sz w:val="16"/>
+              </w:rPr>
+              <w:t>MAIN FUNCTIONALITY</w:t>
+            </w:r>
+          </w:p>
+        </w:tc>
+      </w:tr>
+      <w:tr>
+        <w:tc>
+          <w:tcPr>
+            <w:tcW w:type="dxa" w:w="1960"/>
+            <w:tcMar>
+              <w:top w:w="85" w:type="dxa"/>
+              <w:start w:w="130" w:type="dxa"/>
+              <w:bottom w:w="85" w:type="dxa"/>
+              <w:end w:w="130" w:type="dxa"/>
+            </w:tcMar>
+            <w:vAlign w:val="center"/>
+            <w:shd w:fill="F7F4EF"/>
+          </w:tcPr>
+          <w:p>
+            <w:pPr>
+              <w:spacing w:after="0"/>
+            </w:pPr>
+            <w:r/>
+            <w:r>
+              <w:rPr>
+                <w:rFonts w:ascii="Aptos" w:hAnsi="Aptos"/>
+                <w:b/>
+                <w:i w:val="0"/>
+                <w:color w:val="C99A3D"/>
+                <w:sz w:val="18"/>
+              </w:rPr>
+              <w:t>Home</w:t>
+            </w:r>
+          </w:p>
+        </w:tc>
+        <w:tc>
+          <w:tcPr>
+            <w:tcW w:type="dxa" w:w="7400"/>
+            <w:tcMar>
+              <w:top w:w="85" w:type="dxa"/>
+              <w:start w:w="130" w:type="dxa"/>
+              <w:bottom w:w="85" w:type="dxa"/>
+              <w:end w:w="130" w:type="dxa"/>
+            </w:tcMar>
+            <w:vAlign w:val="center"/>
+          </w:tcPr>
+          <w:p>
+            <w:pPr>
+              <w:spacing w:after="0" w:line="250" w:lineRule="auto"/>
+            </w:pPr>
+            <w:r/>
+            <w:r>
+              <w:rPr>
+                <w:rFonts w:ascii="Aptos" w:hAnsi="Aptos"/>
+                <w:b w:val="0"/>
+                <w:i w:val="0"/>
+                <w:color w:val="211D22"/>
                 <w:sz w:val="17"/>
               </w:rPr>
-              <w:t>Fashion clients and visitors, alongside lecturers or assessors reviewing the project requirements.</w:t>
+              <w:t>Introduces the brand through a hero section, featured products, key collection highlights and an appointment call-to-action.</w:t>
+            </w:r>
+          </w:p>
+        </w:tc>
+      </w:tr>
+      <w:tr>
+        <w:tc>
+          <w:tcPr>
+            <w:tcW w:type="dxa" w:w="1960"/>
+            <w:tcMar>
+              <w:top w:w="85" w:type="dxa"/>
+              <w:start w:w="130" w:type="dxa"/>
+              <w:bottom w:w="85" w:type="dxa"/>
+              <w:end w:w="130" w:type="dxa"/>
+            </w:tcMar>
+            <w:vAlign w:val="center"/>
+            <w:shd w:fill="F7F4EF"/>
+          </w:tcPr>
+          <w:p>
+            <w:pPr>
+              <w:spacing w:after="0"/>
+            </w:pPr>
+            <w:r/>
+            <w:r>
+              <w:rPr>
+                <w:rFonts w:ascii="Aptos" w:hAnsi="Aptos"/>
+                <w:b/>
+                <w:i w:val="0"/>
+                <w:color w:val="C99A3D"/>
+                <w:sz w:val="18"/>
+              </w:rPr>
+              <w:t>Products</w:t>
+            </w:r>
+          </w:p>
+        </w:tc>
+        <w:tc>
+          <w:tcPr>
+            <w:tcW w:type="dxa" w:w="7400"/>
+            <w:tcMar>
+              <w:top w:w="85" w:type="dxa"/>
+              <w:start w:w="130" w:type="dxa"/>
+              <w:bottom w:w="85" w:type="dxa"/>
+              <w:end w:w="130" w:type="dxa"/>
+            </w:tcMar>
+            <w:vAlign w:val="center"/>
+          </w:tcPr>
+          <w:p>
+            <w:pPr>
+              <w:spacing w:after="0" w:line="250" w:lineRule="auto"/>
+            </w:pPr>
+            <w:r/>
+            <w:r>
+              <w:rPr>
+                <w:rFonts w:ascii="Aptos" w:hAnsi="Aptos"/>
+                <w:b w:val="0"/>
+                <w:i w:val="0"/>
+                <w:color w:val="211D22"/>
+                <w:sz w:val="17"/>
+              </w:rPr>
+              <w:t>Presents a visual catalogue with categories for couture, formal wear, ready-to-wear, bridal, accessories and footwear.</w:t>
+            </w:r>
+          </w:p>
+        </w:tc>
+      </w:tr>
+      <w:tr>
+        <w:tc>
+          <w:tcPr>
+            <w:tcW w:type="dxa" w:w="1960"/>
+            <w:tcMar>
+              <w:top w:w="85" w:type="dxa"/>
+              <w:start w:w="130" w:type="dxa"/>
+              <w:bottom w:w="85" w:type="dxa"/>
+              <w:end w:w="130" w:type="dxa"/>
+            </w:tcMar>
+            <w:vAlign w:val="center"/>
+            <w:shd w:fill="F7F4EF"/>
+          </w:tcPr>
+          <w:p>
+            <w:pPr>
+              <w:spacing w:after="0"/>
+            </w:pPr>
+            <w:r/>
+            <w:r>
+              <w:rPr>
+                <w:rFonts w:ascii="Aptos" w:hAnsi="Aptos"/>
+                <w:b/>
+                <w:i w:val="0"/>
+                <w:color w:val="C99A3D"/>
+                <w:sz w:val="18"/>
+              </w:rPr>
+              <w:t>Events</w:t>
+            </w:r>
+          </w:p>
+        </w:tc>
+        <w:tc>
+          <w:tcPr>
+            <w:tcW w:type="dxa" w:w="7400"/>
+            <w:tcMar>
+              <w:top w:w="85" w:type="dxa"/>
+              <w:start w:w="130" w:type="dxa"/>
+              <w:bottom w:w="85" w:type="dxa"/>
+              <w:end w:w="130" w:type="dxa"/>
+            </w:tcMar>
+            <w:vAlign w:val="center"/>
+          </w:tcPr>
+          <w:p>
+            <w:pPr>
+              <w:spacing w:after="0" w:line="250" w:lineRule="auto"/>
+            </w:pPr>
+            <w:r/>
+            <w:r>
+              <w:rPr>
+                <w:rFonts w:ascii="Aptos" w:hAnsi="Aptos"/>
+                <w:b w:val="0"/>
+                <w:i w:val="0"/>
+                <w:color w:val="211D22"/>
+                <w:sz w:val="17"/>
+              </w:rPr>
+              <w:t>Highlights the next major fashion event, displays a live countdown and connects event cards to appointment booking.</w:t>
+            </w:r>
+          </w:p>
+        </w:tc>
+      </w:tr>
+      <w:tr>
+        <w:tc>
+          <w:tcPr>
+            <w:tcW w:type="dxa" w:w="1960"/>
+            <w:tcMar>
+              <w:top w:w="85" w:type="dxa"/>
+              <w:start w:w="130" w:type="dxa"/>
+              <w:bottom w:w="85" w:type="dxa"/>
+              <w:end w:w="130" w:type="dxa"/>
+            </w:tcMar>
+            <w:vAlign w:val="center"/>
+            <w:shd w:fill="F7F4EF"/>
+          </w:tcPr>
+          <w:p>
+            <w:pPr>
+              <w:spacing w:after="0"/>
+            </w:pPr>
+            <w:r/>
+            <w:r>
+              <w:rPr>
+                <w:rFonts w:ascii="Aptos" w:hAnsi="Aptos"/>
+                <w:b/>
+                <w:i w:val="0"/>
+                <w:color w:val="C99A3D"/>
+                <w:sz w:val="18"/>
+              </w:rPr>
+              <w:t>Board</w:t>
+            </w:r>
+          </w:p>
+        </w:tc>
+        <w:tc>
+          <w:tcPr>
+            <w:tcW w:type="dxa" w:w="7400"/>
+            <w:tcMar>
+              <w:top w:w="85" w:type="dxa"/>
+              <w:start w:w="130" w:type="dxa"/>
+              <w:bottom w:w="85" w:type="dxa"/>
+              <w:end w:w="130" w:type="dxa"/>
+            </w:tcMar>
+            <w:vAlign w:val="center"/>
+          </w:tcPr>
+          <w:p>
+            <w:pPr>
+              <w:spacing w:after="0" w:line="250" w:lineRule="auto"/>
+            </w:pPr>
+            <w:r/>
+            <w:r>
+              <w:rPr>
+                <w:rFonts w:ascii="Aptos" w:hAnsi="Aptos"/>
+                <w:b w:val="0"/>
+                <w:i w:val="0"/>
+                <w:color w:val="211D22"/>
+                <w:sz w:val="17"/>
+              </w:rPr>
+              <w:t>Introduces the leadership team and allows visitors to open concise profile details for each board member.</w:t>
+            </w:r>
+          </w:p>
+        </w:tc>
+      </w:tr>
+      <w:tr>
+        <w:tc>
+          <w:tcPr>
+            <w:tcW w:type="dxa" w:w="1960"/>
+            <w:tcMar>
+              <w:top w:w="85" w:type="dxa"/>
+              <w:start w:w="130" w:type="dxa"/>
+              <w:bottom w:w="85" w:type="dxa"/>
+              <w:end w:w="130" w:type="dxa"/>
+            </w:tcMar>
+            <w:vAlign w:val="center"/>
+            <w:shd w:fill="F7F4EF"/>
+          </w:tcPr>
+          <w:p>
+            <w:pPr>
+              <w:spacing w:after="0"/>
+            </w:pPr>
+            <w:r/>
+            <w:r>
+              <w:rPr>
+                <w:rFonts w:ascii="Aptos" w:hAnsi="Aptos"/>
+                <w:b/>
+                <w:i w:val="0"/>
+                <w:color w:val="C99A3D"/>
+                <w:sz w:val="18"/>
+              </w:rPr>
+              <w:t>Contact / Appointments</w:t>
+            </w:r>
+          </w:p>
+        </w:tc>
+        <w:tc>
+          <w:tcPr>
+            <w:tcW w:type="dxa" w:w="7400"/>
+            <w:tcMar>
+              <w:top w:w="85" w:type="dxa"/>
+              <w:start w:w="130" w:type="dxa"/>
+              <w:bottom w:w="85" w:type="dxa"/>
+              <w:end w:w="130" w:type="dxa"/>
+            </w:tcMar>
+            <w:vAlign w:val="center"/>
+          </w:tcPr>
+          <w:p>
+            <w:pPr>
+              <w:spacing w:after="0" w:line="250" w:lineRule="auto"/>
+            </w:pPr>
+            <w:r/>
+            <w:r>
+              <w:rPr>
+                <w:rFonts w:ascii="Aptos" w:hAnsi="Aptos"/>
+                <w:b w:val="0"/>
+                <w:i w:val="0"/>
+                <w:color w:val="211D22"/>
+                <w:sz w:val="17"/>
+              </w:rPr>
+              <w:t>Collects client details, service choice, preferred date and message while also displaying studio contact information and opening hours.</w:t>
             </w:r>
           </w:p>
         </w:tc>
@@ -658,20 +1002,943 @@
         <w:pStyle w:val="Heading2"/>
       </w:pPr>
       <w:r>
-        <w:t>Website Link</w:t>
+        <w:t>JavaScript Features</w:t>
+      </w:r>
+    </w:p>
+    <w:tbl>
+      <w:tblPr>
+        <w:tblW w:type="dxa" w:w="9360"/>
+        <w:jc w:val="left"/>
+        <w:tblLayout w:type="fixed"/>
+        <w:tblLook w:firstColumn="1" w:firstRow="1" w:lastColumn="0" w:lastRow="0" w:noHBand="0" w:noVBand="1" w:val="04A0"/>
+        <w:tblInd w:w="120" w:type="dxa"/>
+        <w:tblBorders>
+          <w:top w:val="single" w:sz="5" w:color="DED7CE"/>
+          <w:left w:val="single" w:sz="5" w:color="DED7CE"/>
+          <w:bottom w:val="single" w:sz="5" w:color="DED7CE"/>
+          <w:right w:val="single" w:sz="5" w:color="DED7CE"/>
+          <w:insideH w:val="single" w:sz="5" w:color="DED7CE"/>
+          <w:insideV w:val="single" w:sz="5" w:color="DED7CE"/>
+        </w:tblBorders>
+      </w:tblPr>
+      <w:tblGrid>
+        <w:gridCol w:w="1960"/>
+        <w:gridCol w:w="7400"/>
+      </w:tblGrid>
+      <w:tr>
+        <w:trPr>
+          <w:tblHeader w:val="true"/>
+        </w:trPr>
+        <w:tc>
+          <w:tcPr>
+            <w:tcW w:type="dxa" w:w="1960"/>
+            <w:tcMar>
+              <w:top w:w="80" w:type="dxa"/>
+              <w:start w:w="130" w:type="dxa"/>
+              <w:bottom w:w="80" w:type="dxa"/>
+              <w:end w:w="130" w:type="dxa"/>
+            </w:tcMar>
+            <w:shd w:fill="111014"/>
+          </w:tcPr>
+          <w:p>
+            <w:r/>
+            <w:r>
+              <w:rPr>
+                <w:rFonts w:ascii="Aptos" w:hAnsi="Aptos"/>
+                <w:b/>
+                <w:i w:val="0"/>
+                <w:color w:val="F6E8C8"/>
+                <w:sz w:val="16"/>
+              </w:rPr>
+              <w:t>PAGE</w:t>
+            </w:r>
+          </w:p>
+        </w:tc>
+        <w:tc>
+          <w:tcPr>
+            <w:tcW w:type="dxa" w:w="7400"/>
+            <w:tcMar>
+              <w:top w:w="80" w:type="dxa"/>
+              <w:start w:w="130" w:type="dxa"/>
+              <w:bottom w:w="80" w:type="dxa"/>
+              <w:end w:w="130" w:type="dxa"/>
+            </w:tcMar>
+            <w:shd w:fill="111014"/>
+          </w:tcPr>
+          <w:p>
+            <w:r/>
+            <w:r>
+              <w:rPr>
+                <w:rFonts w:ascii="Aptos" w:hAnsi="Aptos"/>
+                <w:b/>
+                <w:i w:val="0"/>
+                <w:color w:val="F6E8C8"/>
+                <w:sz w:val="16"/>
+              </w:rPr>
+              <w:t>JAVASCRIPT FUNCTIONALITY</w:t>
+            </w:r>
+          </w:p>
+        </w:tc>
+      </w:tr>
+      <w:tr>
+        <w:tc>
+          <w:tcPr>
+            <w:tcW w:type="dxa" w:w="1960"/>
+            <w:tcMar>
+              <w:top w:w="65" w:type="dxa"/>
+              <w:start w:w="130" w:type="dxa"/>
+              <w:bottom w:w="65" w:type="dxa"/>
+              <w:end w:w="130" w:type="dxa"/>
+            </w:tcMar>
+            <w:vAlign w:val="center"/>
+            <w:shd w:fill="F7F4EF"/>
+          </w:tcPr>
+          <w:p>
+            <w:pPr>
+              <w:spacing w:after="0"/>
+            </w:pPr>
+            <w:r/>
+            <w:r>
+              <w:rPr>
+                <w:rFonts w:ascii="Aptos" w:hAnsi="Aptos"/>
+                <w:b/>
+                <w:i w:val="0"/>
+                <w:color w:val="C99A3D"/>
+                <w:sz w:val="17"/>
+              </w:rPr>
+              <w:t>All pages</w:t>
+            </w:r>
+          </w:p>
+        </w:tc>
+        <w:tc>
+          <w:tcPr>
+            <w:tcW w:type="dxa" w:w="7400"/>
+            <w:tcMar>
+              <w:top w:w="65" w:type="dxa"/>
+              <w:start w:w="130" w:type="dxa"/>
+              <w:bottom w:w="65" w:type="dxa"/>
+              <w:end w:w="130" w:type="dxa"/>
+            </w:tcMar>
+            <w:vAlign w:val="center"/>
+          </w:tcPr>
+          <w:p>
+            <w:pPr>
+              <w:spacing w:after="0" w:line="245" w:lineRule="auto"/>
+            </w:pPr>
+            <w:r/>
+            <w:r>
+              <w:rPr>
+                <w:rFonts w:ascii="Aptos" w:hAnsi="Aptos"/>
+                <w:b w:val="0"/>
+                <w:i w:val="0"/>
+                <w:color w:val="211D22"/>
+                <w:sz w:val="16"/>
+              </w:rPr>
+              <w:t>Active-page highlighting, responsive mobile navigation, scroll-reveal animation and automatic footer year.</w:t>
+            </w:r>
+          </w:p>
+        </w:tc>
+      </w:tr>
+      <w:tr>
+        <w:tc>
+          <w:tcPr>
+            <w:tcW w:type="dxa" w:w="1960"/>
+            <w:tcMar>
+              <w:top w:w="65" w:type="dxa"/>
+              <w:start w:w="130" w:type="dxa"/>
+              <w:bottom w:w="65" w:type="dxa"/>
+              <w:end w:w="130" w:type="dxa"/>
+            </w:tcMar>
+            <w:vAlign w:val="center"/>
+            <w:shd w:fill="F7F4EF"/>
+          </w:tcPr>
+          <w:p>
+            <w:pPr>
+              <w:spacing w:after="0"/>
+            </w:pPr>
+            <w:r/>
+            <w:r>
+              <w:rPr>
+                <w:rFonts w:ascii="Aptos" w:hAnsi="Aptos"/>
+                <w:b/>
+                <w:i w:val="0"/>
+                <w:color w:val="C99A3D"/>
+                <w:sz w:val="17"/>
+              </w:rPr>
+              <w:t>Home</w:t>
+            </w:r>
+          </w:p>
+        </w:tc>
+        <w:tc>
+          <w:tcPr>
+            <w:tcW w:type="dxa" w:w="7400"/>
+            <w:tcMar>
+              <w:top w:w="65" w:type="dxa"/>
+              <w:start w:w="130" w:type="dxa"/>
+              <w:bottom w:w="65" w:type="dxa"/>
+              <w:end w:w="130" w:type="dxa"/>
+            </w:tcMar>
+            <w:vAlign w:val="center"/>
+          </w:tcPr>
+          <w:p>
+            <w:pPr>
+              <w:spacing w:after="0" w:line="245" w:lineRule="auto"/>
+            </w:pPr>
+            <w:r/>
+            <w:r>
+              <w:rPr>
+                <w:rFonts w:ascii="Aptos" w:hAnsi="Aptos"/>
+                <w:b w:val="0"/>
+                <w:i w:val="0"/>
+                <w:color w:val="211D22"/>
+                <w:sz w:val="16"/>
+              </w:rPr>
+              <w:t>Typewriter-style motto and animated numerical counters.</w:t>
+            </w:r>
+          </w:p>
+        </w:tc>
+      </w:tr>
+      <w:tr>
+        <w:tc>
+          <w:tcPr>
+            <w:tcW w:type="dxa" w:w="1960"/>
+            <w:tcMar>
+              <w:top w:w="65" w:type="dxa"/>
+              <w:start w:w="130" w:type="dxa"/>
+              <w:bottom w:w="65" w:type="dxa"/>
+              <w:end w:w="130" w:type="dxa"/>
+            </w:tcMar>
+            <w:vAlign w:val="center"/>
+            <w:shd w:fill="F7F4EF"/>
+          </w:tcPr>
+          <w:p>
+            <w:pPr>
+              <w:spacing w:after="0"/>
+            </w:pPr>
+            <w:r/>
+            <w:r>
+              <w:rPr>
+                <w:rFonts w:ascii="Aptos" w:hAnsi="Aptos"/>
+                <w:b/>
+                <w:i w:val="0"/>
+                <w:color w:val="C99A3D"/>
+                <w:sz w:val="17"/>
+              </w:rPr>
+              <w:t>Products</w:t>
+            </w:r>
+          </w:p>
+        </w:tc>
+        <w:tc>
+          <w:tcPr>
+            <w:tcW w:type="dxa" w:w="7400"/>
+            <w:tcMar>
+              <w:top w:w="65" w:type="dxa"/>
+              <w:start w:w="130" w:type="dxa"/>
+              <w:bottom w:w="65" w:type="dxa"/>
+              <w:end w:w="130" w:type="dxa"/>
+            </w:tcMar>
+            <w:vAlign w:val="center"/>
+          </w:tcPr>
+          <w:p>
+            <w:pPr>
+              <w:spacing w:after="0" w:line="245" w:lineRule="auto"/>
+            </w:pPr>
+            <w:r/>
+            <w:r>
+              <w:rPr>
+                <w:rFonts w:ascii="Aptos" w:hAnsi="Aptos"/>
+                <w:b w:val="0"/>
+                <w:i w:val="0"/>
+                <w:color w:val="211D22"/>
+                <w:sz w:val="16"/>
+              </w:rPr>
+              <w:t>Category buttons filter product cards without changing catalogue order.</w:t>
+            </w:r>
+          </w:p>
+        </w:tc>
+      </w:tr>
+      <w:tr>
+        <w:tc>
+          <w:tcPr>
+            <w:tcW w:type="dxa" w:w="1960"/>
+            <w:tcMar>
+              <w:top w:w="65" w:type="dxa"/>
+              <w:start w:w="130" w:type="dxa"/>
+              <w:bottom w:w="65" w:type="dxa"/>
+              <w:end w:w="130" w:type="dxa"/>
+            </w:tcMar>
+            <w:vAlign w:val="center"/>
+            <w:shd w:fill="F7F4EF"/>
+          </w:tcPr>
+          <w:p>
+            <w:pPr>
+              <w:spacing w:after="0"/>
+            </w:pPr>
+            <w:r/>
+            <w:r>
+              <w:rPr>
+                <w:rFonts w:ascii="Aptos" w:hAnsi="Aptos"/>
+                <w:b/>
+                <w:i w:val="0"/>
+                <w:color w:val="C99A3D"/>
+                <w:sz w:val="17"/>
+              </w:rPr>
+              <w:t>Events</w:t>
+            </w:r>
+          </w:p>
+        </w:tc>
+        <w:tc>
+          <w:tcPr>
+            <w:tcW w:type="dxa" w:w="7400"/>
+            <w:tcMar>
+              <w:top w:w="65" w:type="dxa"/>
+              <w:start w:w="130" w:type="dxa"/>
+              <w:bottom w:w="65" w:type="dxa"/>
+              <w:end w:w="130" w:type="dxa"/>
+            </w:tcMar>
+            <w:vAlign w:val="center"/>
+          </w:tcPr>
+          <w:p>
+            <w:pPr>
+              <w:spacing w:after="0" w:line="245" w:lineRule="auto"/>
+            </w:pPr>
+            <w:r/>
+            <w:r>
+              <w:rPr>
+                <w:rFonts w:ascii="Aptos" w:hAnsi="Aptos"/>
+                <w:b w:val="0"/>
+                <w:i w:val="0"/>
+                <w:color w:val="211D22"/>
+                <w:sz w:val="16"/>
+              </w:rPr>
+              <w:t>Countdown timer calculates the remaining days, hours and minutes.</w:t>
+            </w:r>
+          </w:p>
+        </w:tc>
+      </w:tr>
+      <w:tr>
+        <w:tc>
+          <w:tcPr>
+            <w:tcW w:type="dxa" w:w="1960"/>
+            <w:tcMar>
+              <w:top w:w="65" w:type="dxa"/>
+              <w:start w:w="130" w:type="dxa"/>
+              <w:bottom w:w="65" w:type="dxa"/>
+              <w:end w:w="130" w:type="dxa"/>
+            </w:tcMar>
+            <w:vAlign w:val="center"/>
+            <w:shd w:fill="F7F4EF"/>
+          </w:tcPr>
+          <w:p>
+            <w:pPr>
+              <w:spacing w:after="0"/>
+            </w:pPr>
+            <w:r/>
+            <w:r>
+              <w:rPr>
+                <w:rFonts w:ascii="Aptos" w:hAnsi="Aptos"/>
+                <w:b/>
+                <w:i w:val="0"/>
+                <w:color w:val="C99A3D"/>
+                <w:sz w:val="17"/>
+              </w:rPr>
+              <w:t>Board</w:t>
+            </w:r>
+          </w:p>
+        </w:tc>
+        <w:tc>
+          <w:tcPr>
+            <w:tcW w:type="dxa" w:w="7400"/>
+            <w:tcMar>
+              <w:top w:w="65" w:type="dxa"/>
+              <w:start w:w="130" w:type="dxa"/>
+              <w:bottom w:w="65" w:type="dxa"/>
+              <w:end w:w="130" w:type="dxa"/>
+            </w:tcMar>
+            <w:vAlign w:val="center"/>
+          </w:tcPr>
+          <w:p>
+            <w:pPr>
+              <w:spacing w:after="0" w:line="245" w:lineRule="auto"/>
+            </w:pPr>
+            <w:r/>
+            <w:r>
+              <w:rPr>
+                <w:rFonts w:ascii="Aptos" w:hAnsi="Aptos"/>
+                <w:b w:val="0"/>
+                <w:i w:val="0"/>
+                <w:color w:val="211D22"/>
+                <w:sz w:val="16"/>
+              </w:rPr>
+              <w:t>Keyboard-accessible profile modal populated from member data attributes.</w:t>
+            </w:r>
+          </w:p>
+        </w:tc>
+      </w:tr>
+      <w:tr>
+        <w:tc>
+          <w:tcPr>
+            <w:tcW w:type="dxa" w:w="1960"/>
+            <w:tcMar>
+              <w:top w:w="65" w:type="dxa"/>
+              <w:start w:w="130" w:type="dxa"/>
+              <w:bottom w:w="65" w:type="dxa"/>
+              <w:end w:w="130" w:type="dxa"/>
+            </w:tcMar>
+            <w:vAlign w:val="center"/>
+            <w:shd w:fill="F7F4EF"/>
+          </w:tcPr>
+          <w:p>
+            <w:pPr>
+              <w:spacing w:after="0"/>
+            </w:pPr>
+            <w:r/>
+            <w:r>
+              <w:rPr>
+                <w:rFonts w:ascii="Aptos" w:hAnsi="Aptos"/>
+                <w:b/>
+                <w:i w:val="0"/>
+                <w:color w:val="C99A3D"/>
+                <w:sz w:val="17"/>
+              </w:rPr>
+              <w:t>Contact</w:t>
+            </w:r>
+          </w:p>
+        </w:tc>
+        <w:tc>
+          <w:tcPr>
+            <w:tcW w:type="dxa" w:w="7400"/>
+            <w:tcMar>
+              <w:top w:w="65" w:type="dxa"/>
+              <w:start w:w="130" w:type="dxa"/>
+              <w:bottom w:w="65" w:type="dxa"/>
+              <w:end w:w="130" w:type="dxa"/>
+            </w:tcMar>
+            <w:vAlign w:val="center"/>
+          </w:tcPr>
+          <w:p>
+            <w:pPr>
+              <w:spacing w:after="0" w:line="245" w:lineRule="auto"/>
+            </w:pPr>
+            <w:r/>
+            <w:r>
+              <w:rPr>
+                <w:rFonts w:ascii="Aptos" w:hAnsi="Aptos"/>
+                <w:b w:val="0"/>
+                <w:i w:val="0"/>
+                <w:color w:val="211D22"/>
+                <w:sz w:val="16"/>
+              </w:rPr>
+              <w:t>Event-query prefill and client-facing submission confirmation.</w:t>
+            </w:r>
+          </w:p>
+        </w:tc>
+      </w:tr>
+    </w:tbl>
+    <w:p>
+      <w:pPr>
+        <w:pStyle w:val="Heading2"/>
+      </w:pPr>
+      <w:r>
+        <w:t>DOM Structure</w:t>
       </w:r>
     </w:p>
     <w:p>
       <w:pPr>
-        <w:spacing w:after="80"/>
+        <w:spacing w:before="0" w:after="80" w:line="240" w:lineRule="auto"/>
+        <w:ind w:left="173" w:right="173"/>
+        <w:shd w:fill="F7F4EF"/>
       </w:pPr>
-      <w:hyperlink r:id="rId12">
+      <w:r>
+        <w:rPr>
+          <w:rFonts w:ascii="Consolas" w:hAnsi="Consolas"/>
+          <w:b w:val="0"/>
+          <w:i w:val="0"/>
+          <w:color w:val="211D22"/>
+          <w:sz w:val="16"/>
+        </w:rPr>
+        <w:t>html</w:t>
+        <w:br/>
+        <w:t>├── head  → metadata, title, styles.css, deferred script.js</w:t>
+        <w:br/>
+        <w:t>└── body[data-page]</w:t>
+        <w:br/>
+        <w:t xml:space="preserve">    ├── header.site-header  → navigation and announcement ticker</w:t>
+        <w:br/>
+        <w:t xml:space="preserve">    ├── main  → page hero and page-specific semantic sections</w:t>
+        <w:br/>
+        <w:t xml:space="preserve">    └── footer.site-footer</w:t>
+      </w:r>
+    </w:p>
+    <w:p>
+      <w:pPr>
+        <w:spacing w:after="0"/>
+      </w:pPr>
+      <w:r>
+        <w:rPr>
+          <w:rFonts w:ascii="Aptos" w:hAnsi="Aptos"/>
+          <w:b w:val="0"/>
+          <w:i w:val="0"/>
+          <w:color w:val="716873"/>
+          <w:sz w:val="17"/>
+        </w:rPr>
+        <w:t>Every page follows this semantic HTML5 pattern. Shared header, navigation, main-content and footer regions make the code easier to maintain, while meaningful landmarks, labels and descriptive image text improve navigation and accessibility.</w:t>
+      </w:r>
+    </w:p>
+    <w:p>
+      <w:r>
+        <w:br w:type="page"/>
+      </w:r>
+    </w:p>
+    <w:p>
+      <w:pPr>
+        <w:pStyle w:val="Heading1"/>
+        <w:spacing w:before="0"/>
+      </w:pPr>
+      <w:r>
+        <w:t>Website Screenshots</w:t>
+      </w:r>
+    </w:p>
+    <w:p>
+      <w:pPr>
+        <w:pStyle w:val="Heading2"/>
+        <w:spacing w:before="80" w:after="60"/>
+      </w:pPr>
+      <w:r>
+        <w:t>Home</w:t>
+      </w:r>
+    </w:p>
+    <w:p>
+      <w:pPr>
+        <w:spacing w:before="0" w:after="40"/>
+        <w:jc w:val="center"/>
+      </w:pPr>
+      <w:r>
+        <w:drawing>
+          <wp:inline xmlns:a="http://schemas.openxmlformats.org/drawingml/2006/main" xmlns:pic="http://schemas.openxmlformats.org/drawingml/2006/picture">
+            <wp:extent cx="5715000" cy="3475224"/>
+            <wp:docPr id="1" name="Picture 1" descr="Aurora Vogue homepage showing the fashion hero image, brand title and navigation" title="Aurora Vogue homepage showing the fashion hero image, brand title and navigation"/>
+            <wp:cNvGraphicFramePr>
+              <a:graphicFrameLocks noChangeAspect="1"/>
+            </wp:cNvGraphicFramePr>
+            <a:graphic>
+              <a:graphicData uri="http://schemas.openxmlformats.org/drawingml/2006/picture">
+                <pic:pic>
+                  <pic:nvPicPr>
+                    <pic:cNvPr id="0" name="Screenshot From 2026-07-16 14-43-33.jpg"/>
+                    <pic:cNvPicPr/>
+                  </pic:nvPicPr>
+                  <pic:blipFill>
+                    <a:blip r:embed="rId11"/>
+                    <a:stretch>
+                      <a:fillRect/>
+                    </a:stretch>
+                  </pic:blipFill>
+                  <pic:spPr>
+                    <a:xfrm>
+                      <a:off x="0" y="0"/>
+                      <a:ext cx="5715000" cy="3475224"/>
+                    </a:xfrm>
+                    <a:prstGeom prst="rect"/>
+                  </pic:spPr>
+                </pic:pic>
+              </a:graphicData>
+            </a:graphic>
+          </wp:inline>
+        </w:drawing>
+      </w:r>
+    </w:p>
+    <w:p>
+      <w:pPr>
+        <w:spacing w:before="0" w:after="60"/>
+        <w:jc w:val="center"/>
+      </w:pPr>
+      <w:r>
+        <w:rPr>
+          <w:rFonts w:ascii="Aptos" w:hAnsi="Aptos"/>
+          <w:b w:val="0"/>
+          <w:i/>
+          <w:color w:val="716873"/>
+          <w:sz w:val="16"/>
+        </w:rPr>
+        <w:t>Figure 1. Aurora Vogue homepage with hero branding and primary navigation.</w:t>
+      </w:r>
+    </w:p>
+    <w:p>
+      <w:pPr>
+        <w:pStyle w:val="Heading2"/>
+        <w:spacing w:before="80" w:after="60"/>
+      </w:pPr>
+      <w:r>
+        <w:t>Products</w:t>
+      </w:r>
+    </w:p>
+    <w:p>
+      <w:pPr>
+        <w:spacing w:before="0" w:after="40"/>
+        <w:jc w:val="center"/>
+      </w:pPr>
+      <w:r>
+        <w:drawing>
+          <wp:inline xmlns:a="http://schemas.openxmlformats.org/drawingml/2006/main" xmlns:pic="http://schemas.openxmlformats.org/drawingml/2006/picture">
+            <wp:extent cx="5715000" cy="3475224"/>
+            <wp:docPr id="2" name="Picture 2" descr="Aurora Vogue products page showing category filters and product cards" title="Aurora Vogue products page showing category filters and product cards"/>
+            <wp:cNvGraphicFramePr>
+              <a:graphicFrameLocks noChangeAspect="1"/>
+            </wp:cNvGraphicFramePr>
+            <a:graphic>
+              <a:graphicData uri="http://schemas.openxmlformats.org/drawingml/2006/picture">
+                <pic:pic>
+                  <pic:nvPicPr>
+                    <pic:cNvPr id="0" name="Screenshot From 2026-07-16 14-43-45.jpg"/>
+                    <pic:cNvPicPr/>
+                  </pic:nvPicPr>
+                  <pic:blipFill>
+                    <a:blip r:embed="rId12"/>
+                    <a:stretch>
+                      <a:fillRect/>
+                    </a:stretch>
+                  </pic:blipFill>
+                  <pic:spPr>
+                    <a:xfrm>
+                      <a:off x="0" y="0"/>
+                      <a:ext cx="5715000" cy="3475224"/>
+                    </a:xfrm>
+                    <a:prstGeom prst="rect"/>
+                  </pic:spPr>
+                </pic:pic>
+              </a:graphicData>
+            </a:graphic>
+          </wp:inline>
+        </w:drawing>
+      </w:r>
+    </w:p>
+    <w:p>
+      <w:pPr>
+        <w:spacing w:before="0" w:after="60"/>
+        <w:jc w:val="center"/>
+      </w:pPr>
+      <w:r>
+        <w:rPr>
+          <w:rFonts w:ascii="Aptos" w:hAnsi="Aptos"/>
+          <w:b w:val="0"/>
+          <w:i/>
+          <w:color w:val="716873"/>
+          <w:sz w:val="16"/>
+        </w:rPr>
+        <w:t>Figure 2. Product catalogue with category filters and visual product cards.</w:t>
+      </w:r>
+    </w:p>
+    <w:p>
+      <w:r>
+        <w:br w:type="page"/>
+      </w:r>
+    </w:p>
+    <w:p>
+      <w:pPr>
+        <w:spacing w:before="0" w:after="40"/>
+      </w:pPr>
+      <w:r>
+        <w:rPr>
+          <w:rFonts w:ascii="Aptos" w:hAnsi="Aptos"/>
+          <w:b/>
+          <w:i w:val="0"/>
+          <w:color w:val="C99A3D"/>
+          <w:sz w:val="17"/>
+        </w:rPr>
+        <w:t>CONTINUED</w:t>
+      </w:r>
+    </w:p>
+    <w:p>
+      <w:pPr>
+        <w:pStyle w:val="Heading1"/>
+        <w:spacing w:before="0"/>
+      </w:pPr>
+      <w:r>
+        <w:t>Website Screenshots</w:t>
+      </w:r>
+    </w:p>
+    <w:p>
+      <w:pPr>
+        <w:pStyle w:val="Heading2"/>
+        <w:spacing w:before="80" w:after="60"/>
+      </w:pPr>
+      <w:r>
+        <w:t>Events</w:t>
+      </w:r>
+    </w:p>
+    <w:p>
+      <w:pPr>
+        <w:spacing w:before="0" w:after="40"/>
+        <w:jc w:val="center"/>
+      </w:pPr>
+      <w:r>
+        <w:drawing>
+          <wp:inline xmlns:a="http://schemas.openxmlformats.org/drawingml/2006/main" xmlns:pic="http://schemas.openxmlformats.org/drawingml/2006/picture">
+            <wp:extent cx="5715000" cy="3475224"/>
+            <wp:docPr id="3" name="Picture 3" descr="Aurora Vogue events page with Grand Fashion Preview and countdown timer" title="Aurora Vogue events page with Grand Fashion Preview and countdown timer"/>
+            <wp:cNvGraphicFramePr>
+              <a:graphicFrameLocks noChangeAspect="1"/>
+            </wp:cNvGraphicFramePr>
+            <a:graphic>
+              <a:graphicData uri="http://schemas.openxmlformats.org/drawingml/2006/picture">
+                <pic:pic>
+                  <pic:nvPicPr>
+                    <pic:cNvPr id="0" name="Screenshot From 2026-07-16 14-44-35.jpg"/>
+                    <pic:cNvPicPr/>
+                  </pic:nvPicPr>
+                  <pic:blipFill>
+                    <a:blip r:embed="rId13"/>
+                    <a:stretch>
+                      <a:fillRect/>
+                    </a:stretch>
+                  </pic:blipFill>
+                  <pic:spPr>
+                    <a:xfrm>
+                      <a:off x="0" y="0"/>
+                      <a:ext cx="5715000" cy="3475224"/>
+                    </a:xfrm>
+                    <a:prstGeom prst="rect"/>
+                  </pic:spPr>
+                </pic:pic>
+              </a:graphicData>
+            </a:graphic>
+          </wp:inline>
+        </w:drawing>
+      </w:r>
+    </w:p>
+    <w:p>
+      <w:pPr>
+        <w:spacing w:before="0" w:after="60"/>
+        <w:jc w:val="center"/>
+      </w:pPr>
+      <w:r>
+        <w:rPr>
+          <w:rFonts w:ascii="Aptos" w:hAnsi="Aptos"/>
+          <w:b w:val="0"/>
+          <w:i/>
+          <w:color w:val="716873"/>
+          <w:sz w:val="16"/>
+        </w:rPr>
+        <w:t>Figure 3. Events page highlighting the Grand Fashion Preview countdown.</w:t>
+      </w:r>
+    </w:p>
+    <w:p>
+      <w:pPr>
+        <w:pStyle w:val="Heading2"/>
+        <w:spacing w:before="80" w:after="60"/>
+      </w:pPr>
+      <w:r>
+        <w:t>Board</w:t>
+      </w:r>
+    </w:p>
+    <w:p>
+      <w:pPr>
+        <w:spacing w:before="0" w:after="40"/>
+        <w:jc w:val="center"/>
+      </w:pPr>
+      <w:r>
+        <w:drawing>
+          <wp:inline xmlns:a="http://schemas.openxmlformats.org/drawingml/2006/main" xmlns:pic="http://schemas.openxmlformats.org/drawingml/2006/picture">
+            <wp:extent cx="5715000" cy="3475224"/>
+            <wp:docPr id="4" name="Picture 4" descr="Aurora Vogue board page introducing fashion house leadership members" title="Aurora Vogue board page introducing fashion house leadership members"/>
+            <wp:cNvGraphicFramePr>
+              <a:graphicFrameLocks noChangeAspect="1"/>
+            </wp:cNvGraphicFramePr>
+            <a:graphic>
+              <a:graphicData uri="http://schemas.openxmlformats.org/drawingml/2006/picture">
+                <pic:pic>
+                  <pic:nvPicPr>
+                    <pic:cNvPr id="0" name="Screenshot From 2026-07-16 14-44-04.jpg"/>
+                    <pic:cNvPicPr/>
+                  </pic:nvPicPr>
+                  <pic:blipFill>
+                    <a:blip r:embed="rId14"/>
+                    <a:stretch>
+                      <a:fillRect/>
+                    </a:stretch>
+                  </pic:blipFill>
+                  <pic:spPr>
+                    <a:xfrm>
+                      <a:off x="0" y="0"/>
+                      <a:ext cx="5715000" cy="3475224"/>
+                    </a:xfrm>
+                    <a:prstGeom prst="rect"/>
+                  </pic:spPr>
+                </pic:pic>
+              </a:graphicData>
+            </a:graphic>
+          </wp:inline>
+        </w:drawing>
+      </w:r>
+    </w:p>
+    <w:p>
+      <w:pPr>
+        <w:spacing w:before="0" w:after="60"/>
+        <w:jc w:val="center"/>
+      </w:pPr>
+      <w:r>
+        <w:rPr>
+          <w:rFonts w:ascii="Aptos" w:hAnsi="Aptos"/>
+          <w:b w:val="0"/>
+          <w:i/>
+          <w:color w:val="716873"/>
+          <w:sz w:val="16"/>
+        </w:rPr>
+        <w:t>Figure 4. Board page introducing the people guiding the fashion house.</w:t>
+      </w:r>
+    </w:p>
+    <w:p>
+      <w:r>
+        <w:br w:type="page"/>
+      </w:r>
+    </w:p>
+    <w:p>
+      <w:pPr>
+        <w:spacing w:before="0" w:after="40"/>
+      </w:pPr>
+      <w:r>
+        <w:rPr>
+          <w:rFonts w:ascii="Aptos" w:hAnsi="Aptos"/>
+          <w:b/>
+          <w:i w:val="0"/>
+          <w:color w:val="C99A3D"/>
+          <w:sz w:val="17"/>
+        </w:rPr>
+        <w:t>CONTINUED</w:t>
+      </w:r>
+    </w:p>
+    <w:p>
+      <w:pPr>
+        <w:pStyle w:val="Heading1"/>
+        <w:spacing w:before="0"/>
+      </w:pPr>
+      <w:r>
+        <w:t>Website Screenshots</w:t>
+      </w:r>
+    </w:p>
+    <w:p>
+      <w:pPr>
+        <w:pStyle w:val="Heading2"/>
+        <w:spacing w:before="80" w:after="60"/>
+      </w:pPr>
+      <w:r>
+        <w:t>Contact / Appointments</w:t>
+      </w:r>
+    </w:p>
+    <w:p>
+      <w:pPr>
+        <w:spacing w:before="0" w:after="40"/>
+        <w:jc w:val="center"/>
+      </w:pPr>
+      <w:r>
+        <w:drawing>
+          <wp:inline xmlns:a="http://schemas.openxmlformats.org/drawingml/2006/main" xmlns:pic="http://schemas.openxmlformats.org/drawingml/2006/picture">
+            <wp:extent cx="5715000" cy="3475224"/>
+            <wp:docPr id="5" name="Picture 5" descr="Aurora Vogue appointments page with booking form and studio contact information" title="Aurora Vogue appointments page with booking form and studio contact information"/>
+            <wp:cNvGraphicFramePr>
+              <a:graphicFrameLocks noChangeAspect="1"/>
+            </wp:cNvGraphicFramePr>
+            <a:graphic>
+              <a:graphicData uri="http://schemas.openxmlformats.org/drawingml/2006/picture">
+                <pic:pic>
+                  <pic:nvPicPr>
+                    <pic:cNvPr id="0" name="Screenshot From 2026-07-16 14-44-25.jpg"/>
+                    <pic:cNvPicPr/>
+                  </pic:nvPicPr>
+                  <pic:blipFill>
+                    <a:blip r:embed="rId15"/>
+                    <a:stretch>
+                      <a:fillRect/>
+                    </a:stretch>
+                  </pic:blipFill>
+                  <pic:spPr>
+                    <a:xfrm>
+                      <a:off x="0" y="0"/>
+                      <a:ext cx="5715000" cy="3475224"/>
+                    </a:xfrm>
+                    <a:prstGeom prst="rect"/>
+                  </pic:spPr>
+                </pic:pic>
+              </a:graphicData>
+            </a:graphic>
+          </wp:inline>
+        </w:drawing>
+      </w:r>
+    </w:p>
+    <w:p>
+      <w:pPr>
+        <w:spacing w:before="0" w:after="60"/>
+        <w:jc w:val="center"/>
+      </w:pPr>
+      <w:r>
+        <w:rPr>
+          <w:rFonts w:ascii="Aptos" w:hAnsi="Aptos"/>
+          <w:b w:val="0"/>
+          <w:i/>
+          <w:color w:val="716873"/>
+          <w:sz w:val="16"/>
+        </w:rPr>
+        <w:t>Figure 5. Appointment form and studio contact information.</w:t>
+      </w:r>
+    </w:p>
+    <w:p>
+      <w:pPr>
+        <w:pStyle w:val="Heading2"/>
+      </w:pPr>
+      <w:r>
+        <w:t>Source Code &amp; Supporting Files</w:t>
+      </w:r>
+    </w:p>
+    <w:p>
+      <w:pPr>
+        <w:spacing w:after="40"/>
+      </w:pPr>
+      <w:r>
+        <w:rPr>
+          <w:rFonts w:ascii="Aptos" w:hAnsi="Aptos"/>
+          <w:b w:val="0"/>
+          <w:i w:val="0"/>
+          <w:color w:val="211D22"/>
+          <w:sz w:val="18"/>
+        </w:rPr>
+        <w:t>The complete project files and supporting materials are available in the shared Google Drive folder.</w:t>
+      </w:r>
+    </w:p>
+    <w:p>
+      <w:pPr>
+        <w:spacing w:after="60"/>
+      </w:pPr>
+      <w:r>
+        <w:rPr>
+          <w:rFonts w:ascii="Aptos" w:hAnsi="Aptos"/>
+          <w:b/>
+          <w:i w:val="0"/>
+          <w:color w:val="716873"/>
+          <w:sz w:val="18"/>
+        </w:rPr>
+        <w:t>Google Drive: XXXXXXXXXXXXXXXXXXXX</w:t>
+      </w:r>
+    </w:p>
+    <w:p>
+      <w:pPr>
+        <w:pStyle w:val="Heading2"/>
+      </w:pPr>
+      <w:r>
+        <w:t>Live Website</w:t>
+      </w:r>
+    </w:p>
+    <w:p>
+      <w:pPr>
+        <w:spacing w:after="60"/>
+      </w:pPr>
+      <w:hyperlink r:id="rId16">
         <w:r>
           <w:rPr>
             <w:rFonts w:ascii="Aptos" w:hAnsi="Aptos"/>
             <w:color w:val="C99A3D"/>
             <w:b/>
-            <w:sz w:val="21"/>
+            <w:sz w:val="18"/>
             <w:u w:val="single"/>
           </w:rPr>
           <w:t>https://lyttlelyon.github.io/Fashion-House/</w:t>
@@ -683,339 +1950,54 @@
         <w:pStyle w:val="Heading2"/>
       </w:pPr>
       <w:r>
-        <w:t>Demo Link</w:t>
+        <w:t>GitHub Repository</w:t>
       </w:r>
     </w:p>
     <w:p>
       <w:pPr>
-        <w:spacing w:after="140"/>
+        <w:spacing w:after="60"/>
+      </w:pPr>
+      <w:hyperlink r:id="rId17">
+        <w:r>
+          <w:rPr>
+            <w:rFonts w:ascii="Aptos" w:hAnsi="Aptos"/>
+            <w:color w:val="C99A3D"/>
+            <w:b/>
+            <w:sz w:val="18"/>
+            <w:u w:val="single"/>
+          </w:rPr>
+          <w:t>https://github.com/lyttlelyon/Fashion-House</w:t>
+        </w:r>
+      </w:hyperlink>
+    </w:p>
+    <w:p>
+      <w:pPr>
+        <w:pStyle w:val="Heading2"/>
+      </w:pPr>
+      <w:r>
+        <w:t>Conclusion</w:t>
+      </w:r>
+    </w:p>
+    <w:p>
+      <w:pPr>
+        <w:spacing w:after="0"/>
       </w:pPr>
       <w:r>
         <w:rPr>
           <w:rFonts w:ascii="Aptos" w:hAnsi="Aptos"/>
-          <w:b/>
+          <w:b w:val="0"/>
           <w:i w:val="0"/>
-          <w:color w:val="716873"/>
-          <w:sz w:val="21"/>
+          <w:color w:val="211D22"/>
+          <w:sz w:val="18"/>
         </w:rPr>
-        <w:t>XXXXXXXXXXXXXXXXXXXX</w:t>
+        <w:t>Aurora Vogue is a completed, responsive fashion-house website that combines clear navigation, visual product presentation, interactive page features and consistent styling. The final result meets the project’s core multi-page, JavaScript, styling and DOM-documentation requirements in a cohesive user experience.</w:t>
       </w:r>
     </w:p>
-    <w:p>
-      <w:pPr>
-        <w:pStyle w:val="Heading2"/>
-        <w:spacing w:before="120" w:after="100"/>
-      </w:pPr>
-      <w:r>
-        <w:t>Selected Interface Views</w:t>
-      </w:r>
-    </w:p>
-    <w:tbl>
-      <w:tblPr>
-        <w:tblW w:type="dxa" w:w="9360"/>
-        <w:jc w:val="left"/>
-        <w:tblLayout w:type="fixed"/>
-        <w:tblLook w:firstColumn="1" w:firstRow="1" w:lastColumn="0" w:lastRow="0" w:noHBand="0" w:noVBand="1" w:val="04A0"/>
-        <w:tblInd w:w="120" w:type="dxa"/>
-        <w:tblBorders>
-          <w:top w:val="nil"/>
-          <w:left w:val="nil"/>
-          <w:bottom w:val="nil"/>
-          <w:right w:val="nil"/>
-          <w:insideH w:val="nil"/>
-          <w:insideV w:val="nil"/>
-        </w:tblBorders>
-      </w:tblPr>
-      <w:tblGrid>
-        <w:gridCol w:w="4680"/>
-        <w:gridCol w:w="4680"/>
-      </w:tblGrid>
-      <w:tr>
-        <w:tc>
-          <w:tcPr>
-            <w:tcW w:type="dxa" w:w="4680"/>
-            <w:tcMar>
-              <w:top w:w="30" w:type="dxa"/>
-              <w:start w:w="55" w:type="dxa"/>
-              <w:bottom w:w="60" w:type="dxa"/>
-              <w:end w:w="55" w:type="dxa"/>
-            </w:tcMar>
-            <w:vAlign w:val="top"/>
-          </w:tcPr>
-          <w:p>
-            <w:pPr>
-              <w:spacing w:after="40"/>
-              <w:jc w:val="center"/>
-            </w:pPr>
-            <w:r/>
-            <w:r>
-              <w:drawing>
-                <wp:inline xmlns:a="http://schemas.openxmlformats.org/drawingml/2006/main" xmlns:pic="http://schemas.openxmlformats.org/drawingml/2006/picture">
-                  <wp:extent cx="2862072" cy="1740392"/>
-                  <wp:docPr id="2" name="Picture 2" descr="Aurora Vogue product catalogue page with fashion category filters and product cards" title="Aurora Vogue product catalogue page with fashion category filters and product cards"/>
-                  <wp:cNvGraphicFramePr>
-                    <a:graphicFrameLocks noChangeAspect="1"/>
-                  </wp:cNvGraphicFramePr>
-                  <a:graphic>
-                    <a:graphicData uri="http://schemas.openxmlformats.org/drawingml/2006/picture">
-                      <pic:pic>
-                        <pic:nvPicPr>
-                          <pic:cNvPr id="0" name="Screenshot From 2026-07-16 14-43-45.jpg"/>
-                          <pic:cNvPicPr/>
-                        </pic:nvPicPr>
-                        <pic:blipFill>
-                          <a:blip r:embed="rId13"/>
-                          <a:stretch>
-                            <a:fillRect/>
-                          </a:stretch>
-                        </pic:blipFill>
-                        <pic:spPr>
-                          <a:xfrm>
-                            <a:off x="0" y="0"/>
-                            <a:ext cx="2862072" cy="1740392"/>
-                          </a:xfrm>
-                          <a:prstGeom prst="rect"/>
-                        </pic:spPr>
-                      </pic:pic>
-                    </a:graphicData>
-                  </a:graphic>
-                </wp:inline>
-              </w:drawing>
-            </w:r>
-          </w:p>
-          <w:p>
-            <w:pPr>
-              <w:spacing w:before="0" w:after="0"/>
-              <w:jc w:val="center"/>
-            </w:pPr>
-            <w:r>
-              <w:rPr>
-                <w:rFonts w:ascii="Aptos" w:hAnsi="Aptos"/>
-                <w:b w:val="0"/>
-                <w:i/>
-                <w:color w:val="716873"/>
-                <w:sz w:val="15"/>
-              </w:rPr>
-              <w:t>Product catalogue and category filters</w:t>
-            </w:r>
-          </w:p>
-        </w:tc>
-        <w:tc>
-          <w:tcPr>
-            <w:tcW w:type="dxa" w:w="4680"/>
-            <w:tcMar>
-              <w:top w:w="30" w:type="dxa"/>
-              <w:start w:w="55" w:type="dxa"/>
-              <w:bottom w:w="60" w:type="dxa"/>
-              <w:end w:w="55" w:type="dxa"/>
-            </w:tcMar>
-            <w:vAlign w:val="top"/>
-          </w:tcPr>
-          <w:p>
-            <w:pPr>
-              <w:spacing w:after="40"/>
-              <w:jc w:val="center"/>
-            </w:pPr>
-            <w:r/>
-            <w:r>
-              <w:drawing>
-                <wp:inline xmlns:a="http://schemas.openxmlformats.org/drawingml/2006/main" xmlns:pic="http://schemas.openxmlformats.org/drawingml/2006/picture">
-                  <wp:extent cx="2862072" cy="1740392"/>
-                  <wp:docPr id="3" name="Picture 3" descr="Aurora Vogue board page introducing the fashion house leadership team" title="Aurora Vogue board page introducing the fashion house leadership team"/>
-                  <wp:cNvGraphicFramePr>
-                    <a:graphicFrameLocks noChangeAspect="1"/>
-                  </wp:cNvGraphicFramePr>
-                  <a:graphic>
-                    <a:graphicData uri="http://schemas.openxmlformats.org/drawingml/2006/picture">
-                      <pic:pic>
-                        <pic:nvPicPr>
-                          <pic:cNvPr id="0" name="Screenshot From 2026-07-16 14-44-04.jpg"/>
-                          <pic:cNvPicPr/>
-                        </pic:nvPicPr>
-                        <pic:blipFill>
-                          <a:blip r:embed="rId14"/>
-                          <a:stretch>
-                            <a:fillRect/>
-                          </a:stretch>
-                        </pic:blipFill>
-                        <pic:spPr>
-                          <a:xfrm>
-                            <a:off x="0" y="0"/>
-                            <a:ext cx="2862072" cy="1740392"/>
-                          </a:xfrm>
-                          <a:prstGeom prst="rect"/>
-                        </pic:spPr>
-                      </pic:pic>
-                    </a:graphicData>
-                  </a:graphic>
-                </wp:inline>
-              </w:drawing>
-            </w:r>
-          </w:p>
-          <w:p>
-            <w:pPr>
-              <w:spacing w:before="0" w:after="0"/>
-              <w:jc w:val="center"/>
-            </w:pPr>
-            <w:r>
-              <w:rPr>
-                <w:rFonts w:ascii="Aptos" w:hAnsi="Aptos"/>
-                <w:b w:val="0"/>
-                <w:i/>
-                <w:color w:val="716873"/>
-                <w:sz w:val="15"/>
-              </w:rPr>
-              <w:t>Interactive board-member profiles</w:t>
-            </w:r>
-          </w:p>
-        </w:tc>
-      </w:tr>
-      <w:tr>
-        <w:tc>
-          <w:tcPr>
-            <w:tcW w:type="dxa" w:w="4680"/>
-            <w:tcMar>
-              <w:top w:w="30" w:type="dxa"/>
-              <w:start w:w="55" w:type="dxa"/>
-              <w:bottom w:w="60" w:type="dxa"/>
-              <w:end w:w="55" w:type="dxa"/>
-            </w:tcMar>
-            <w:vAlign w:val="top"/>
-          </w:tcPr>
-          <w:p>
-            <w:pPr>
-              <w:spacing w:after="40"/>
-              <w:jc w:val="center"/>
-            </w:pPr>
-            <w:r/>
-            <w:r>
-              <w:drawing>
-                <wp:inline xmlns:a="http://schemas.openxmlformats.org/drawingml/2006/main" xmlns:pic="http://schemas.openxmlformats.org/drawingml/2006/picture">
-                  <wp:extent cx="2862072" cy="1740392"/>
-                  <wp:docPr id="4" name="Picture 4" descr="Aurora Vogue appointments page with booking form and studio contact panel" title="Aurora Vogue appointments page with booking form and studio contact panel"/>
-                  <wp:cNvGraphicFramePr>
-                    <a:graphicFrameLocks noChangeAspect="1"/>
-                  </wp:cNvGraphicFramePr>
-                  <a:graphic>
-                    <a:graphicData uri="http://schemas.openxmlformats.org/drawingml/2006/picture">
-                      <pic:pic>
-                        <pic:nvPicPr>
-                          <pic:cNvPr id="0" name="Screenshot From 2026-07-16 14-44-25.jpg"/>
-                          <pic:cNvPicPr/>
-                        </pic:nvPicPr>
-                        <pic:blipFill>
-                          <a:blip r:embed="rId15"/>
-                          <a:stretch>
-                            <a:fillRect/>
-                          </a:stretch>
-                        </pic:blipFill>
-                        <pic:spPr>
-                          <a:xfrm>
-                            <a:off x="0" y="0"/>
-                            <a:ext cx="2862072" cy="1740392"/>
-                          </a:xfrm>
-                          <a:prstGeom prst="rect"/>
-                        </pic:spPr>
-                      </pic:pic>
-                    </a:graphicData>
-                  </a:graphic>
-                </wp:inline>
-              </w:drawing>
-            </w:r>
-          </w:p>
-          <w:p>
-            <w:pPr>
-              <w:spacing w:before="0" w:after="0"/>
-              <w:jc w:val="center"/>
-            </w:pPr>
-            <w:r>
-              <w:rPr>
-                <w:rFonts w:ascii="Aptos" w:hAnsi="Aptos"/>
-                <w:b w:val="0"/>
-                <w:i/>
-                <w:color w:val="716873"/>
-                <w:sz w:val="15"/>
-              </w:rPr>
-              <w:t>Appointment and inquiry form</w:t>
-            </w:r>
-          </w:p>
-        </w:tc>
-        <w:tc>
-          <w:tcPr>
-            <w:tcW w:type="dxa" w:w="4680"/>
-            <w:tcMar>
-              <w:top w:w="30" w:type="dxa"/>
-              <w:start w:w="55" w:type="dxa"/>
-              <w:bottom w:w="60" w:type="dxa"/>
-              <w:end w:w="55" w:type="dxa"/>
-            </w:tcMar>
-            <w:vAlign w:val="top"/>
-          </w:tcPr>
-          <w:p>
-            <w:pPr>
-              <w:spacing w:after="40"/>
-              <w:jc w:val="center"/>
-            </w:pPr>
-            <w:r/>
-            <w:r>
-              <w:drawing>
-                <wp:inline xmlns:a="http://schemas.openxmlformats.org/drawingml/2006/main" xmlns:pic="http://schemas.openxmlformats.org/drawingml/2006/picture">
-                  <wp:extent cx="2862072" cy="1740392"/>
-                  <wp:docPr id="5" name="Picture 5" descr="Aurora Vogue events page with a Grand Fashion Preview countdown" title="Aurora Vogue events page with a Grand Fashion Preview countdown"/>
-                  <wp:cNvGraphicFramePr>
-                    <a:graphicFrameLocks noChangeAspect="1"/>
-                  </wp:cNvGraphicFramePr>
-                  <a:graphic>
-                    <a:graphicData uri="http://schemas.openxmlformats.org/drawingml/2006/picture">
-                      <pic:pic>
-                        <pic:nvPicPr>
-                          <pic:cNvPr id="0" name="Screenshot From 2026-07-16 14-44-35.jpg"/>
-                          <pic:cNvPicPr/>
-                        </pic:nvPicPr>
-                        <pic:blipFill>
-                          <a:blip r:embed="rId16"/>
-                          <a:stretch>
-                            <a:fillRect/>
-                          </a:stretch>
-                        </pic:blipFill>
-                        <pic:spPr>
-                          <a:xfrm>
-                            <a:off x="0" y="0"/>
-                            <a:ext cx="2862072" cy="1740392"/>
-                          </a:xfrm>
-                          <a:prstGeom prst="rect"/>
-                        </pic:spPr>
-                      </pic:pic>
-                    </a:graphicData>
-                  </a:graphic>
-                </wp:inline>
-              </w:drawing>
-            </w:r>
-          </w:p>
-          <w:p>
-            <w:pPr>
-              <w:spacing w:before="0" w:after="0"/>
-              <w:jc w:val="center"/>
-            </w:pPr>
-            <w:r>
-              <w:rPr>
-                <w:rFonts w:ascii="Aptos" w:hAnsi="Aptos"/>
-                <w:b w:val="0"/>
-                <w:i/>
-                <w:color w:val="716873"/>
-                <w:sz w:val="15"/>
-              </w:rPr>
-              <w:t>Upcoming events and live countdown</w:t>
-            </w:r>
-          </w:p>
-        </w:tc>
-      </w:tr>
-    </w:tbl>
     <w:sectPr>
-      <w:footerReference w:type="default" r:id="rId9"/>
-      <w:headerReference w:type="default" r:id="rId10"/>
+      <w:headerReference w:type="default" r:id="rId9"/>
+      <w:footerReference w:type="default" r:id="rId10"/>
       <w:pgSz w:w="12240" w:h="15840"/>
-      <w:pgMar w:top="1123" w:right="1440" w:bottom="1037" w:left="1440" w:header="504" w:footer="504" w:gutter="0"/>
+      <w:pgMar w:top="1080" w:right="1440" w:bottom="1008" w:left="1440" w:header="461" w:footer="461" w:gutter="0"/>
       <w:cols w:space="720"/>
       <w:titlePg/>
       <w:docGrid w:linePitch="360"/>
@@ -1065,8 +2047,7 @@
   <w:p>
     <w:pPr>
       <w:pStyle w:val="Header"/>
-      <w:spacing w:after="40"/>
-      <w:jc w:val="left"/>
+      <w:spacing w:before="0" w:after="40"/>
     </w:pPr>
     <w:r>
       <w:rPr>
@@ -1074,9 +2055,9 @@
         <w:b/>
         <w:i w:val="0"/>
         <w:color w:val="716873"/>
-        <w:sz w:val="17"/>
-      </w:rPr>
-      <w:t>AURORA VOGUE  |  WEBSITE SUBMISSION</w:t>
+        <w:sz w:val="16"/>
+      </w:rPr>
+      <w:t>AURORA VOGUE  |  WEBSITE PROJECT REPORT</w:t>
     </w:r>
   </w:p>
 </w:hdr>
@@ -1446,12 +2427,12 @@
     <w:qFormat/>
     <w:rsid w:val="00FC693F"/>
     <w:pPr>
-      <w:spacing w:before="0" w:after="120" w:line="264" w:lineRule="auto"/>
+      <w:spacing w:before="0" w:after="100" w:line="259" w:lineRule="auto"/>
     </w:pPr>
     <w:rPr>
       <w:rFonts w:ascii="Aptos" w:hAnsi="Aptos"/>
       <w:color w:val="211D22"/>
-      <w:sz w:val="22"/>
+      <w:sz w:val="21"/>
     </w:rPr>
   </w:style>
   <w:style w:type="paragraph" w:styleId="Header">
@@ -1509,7 +2490,7 @@
     <w:pPr>
       <w:keepNext/>
       <w:keepLines/>
-      <w:spacing w:before="280" w:after="160"/>
+      <w:spacing w:before="200" w:after="140"/>
       <w:outlineLvl w:val="0"/>
     </w:pPr>
     <w:rPr>
@@ -1533,7 +2514,7 @@
     <w:pPr>
       <w:keepNext/>
       <w:keepLines/>
-      <w:spacing w:before="200" w:after="100"/>
+      <w:spacing w:before="160" w:after="80"/>
       <w:outlineLvl w:val="1"/>
     </w:pPr>
     <w:rPr>
@@ -1557,15 +2538,15 @@
     <w:pPr>
       <w:keepNext/>
       <w:keepLines/>
-      <w:spacing w:before="160" w:after="80"/>
+      <w:spacing w:before="100" w:after="40"/>
       <w:outlineLvl w:val="2"/>
     </w:pPr>
     <w:rPr>
       <w:rFonts w:asciiTheme="majorHAnsi" w:eastAsiaTheme="majorEastAsia" w:hAnsiTheme="majorHAnsi" w:cstheme="majorBidi" w:ascii="Aptos" w:hAnsi="Aptos"/>
       <w:b/>
       <w:bCs/>
-      <w:color w:val="C99A3D"/>
-      <w:sz w:val="22"/>
+      <w:color w:val="111014"/>
+      <w:sz w:val="21"/>
     </w:rPr>
   </w:style>
   <w:style w:type="paragraph" w:styleId="Heading4">

</xml_diff>

<commit_message>
Remove Google Drive references from report
</commit_message>
<xml_diff>
--- a/docs/Aurora_Vogue_Website_Submission.docx
+++ b/docs/Aurora_Vogue_Website_Submission.docx
@@ -1902,22 +1902,7 @@
           <w:color w:val="211D22"/>
           <w:sz w:val="18"/>
         </w:rPr>
-        <w:t>The complete project files and supporting materials are available in the shared Google Drive folder.</w:t>
-      </w:r>
-    </w:p>
-    <w:p>
-      <w:pPr>
-        <w:spacing w:after="60"/>
-      </w:pPr>
-      <w:r>
-        <w:rPr>
-          <w:rFonts w:ascii="Aptos" w:hAnsi="Aptos"/>
-          <w:b/>
-          <w:i w:val="0"/>
-          <w:color w:val="716873"/>
-          <w:sz w:val="18"/>
-        </w:rPr>
-        <w:t>Google Drive: XXXXXXXXXXXXXXXXXXXX</w:t>
+        <w:t>The complete source code and supporting project files are available in the GitHub repository listed below.</w:t>
       </w:r>
     </w:p>
     <w:p>

</xml_diff>